<commit_message>
Include all tours (FCSCLT + Community Orgs) in Word export
Updated export to cover both tour pages: the False Creek South /
Senakw / Granville Island seawall tour (3 stops) and the DTES
Community Organizations tour (5 stops). The Word doc now contains
all 8 stops with proper tour grouping and heading hierarchy.

https://claude.ai/code/session_017zrigTAZpqzPEWeDYSJKQN
</commit_message>
<xml_diff>
--- a/BSH_2026_Tour_Content.docx
+++ b/BSH_2026_Tour_Content.docx
@@ -47,6 +47,24 @@
       </w:r>
     </w:p>
     <w:p>
+      <w:r>
+        <w:rPr>
+          <w:b/>
+          <w:sz w:val="22"/>
+        </w:rPr>
+        <w:t>False Creek South, Senakw &amp; Granville Island Tour</w:t>
+      </w:r>
+      <w:r>
+        <w:rPr>
+          <w:i/>
+          <w:color w:val="666666"/>
+          <w:sz w:val="20"/>
+        </w:rPr>
+        <w:br/>
+        <w:t>Seawall walking tour covering public land stewardship, Indigenous-led development, and federal property governance.</w:t>
+      </w:r>
+    </w:p>
+    <w:p>
       <w:pPr>
         <w:pStyle w:val="ListNumber"/>
       </w:pPr>
@@ -72,7 +90,7 @@
         <w:rPr>
           <w:sz w:val="22"/>
         </w:rPr>
-        <w:t>Senákw Development</w:t>
+        <w:t>Senakw Development</w:t>
       </w:r>
       <w:r>
         <w:rPr>
@@ -101,6 +119,24 @@
       </w:r>
     </w:p>
     <w:p>
+      <w:r>
+        <w:rPr>
+          <w:b/>
+          <w:sz w:val="22"/>
+        </w:rPr>
+        <w:t>DTES Community Organizations Tour</w:t>
+      </w:r>
+      <w:r>
+        <w:rPr>
+          <w:i/>
+          <w:color w:val="666666"/>
+          <w:sz w:val="20"/>
+        </w:rPr>
+        <w:br/>
+        <w:t>Walking tour of Downtown Eastside community organizations, land trusts, and tenant advocacy groups.</w:t>
+      </w:r>
+    </w:p>
+    <w:p>
       <w:pPr>
         <w:pStyle w:val="ListNumber"/>
       </w:pPr>
@@ -115,7 +151,79 @@
           <w:color w:val="777777"/>
           <w:sz w:val="20"/>
         </w:rPr>
-        <w:t xml:space="preserve">  —  Downtown Eastside, Vancouver</w:t>
+        <w:t xml:space="preserve">  —  222 Keefer St, Vancouver</w:t>
+      </w:r>
+    </w:p>
+    <w:p>
+      <w:pPr>
+        <w:pStyle w:val="ListNumber"/>
+      </w:pPr>
+      <w:r>
+        <w:rPr>
+          <w:sz w:val="22"/>
+        </w:rPr>
+        <w:t>First United Church</w:t>
+      </w:r>
+      <w:r>
+        <w:rPr>
+          <w:color w:val="777777"/>
+          <w:sz w:val="20"/>
+        </w:rPr>
+        <w:t xml:space="preserve">  —  320 E Hastings St, Vancouver</w:t>
+      </w:r>
+    </w:p>
+    <w:p>
+      <w:pPr>
+        <w:pStyle w:val="ListNumber"/>
+      </w:pPr>
+      <w:r>
+        <w:rPr>
+          <w:sz w:val="22"/>
+        </w:rPr>
+        <w:t>Hogan's Alley Society</w:t>
+      </w:r>
+      <w:r>
+        <w:rPr>
+          <w:color w:val="777777"/>
+          <w:sz w:val="20"/>
+        </w:rPr>
+        <w:t xml:space="preserve">  —  Union Street &amp; Main Street, Vancouver</w:t>
+      </w:r>
+    </w:p>
+    <w:p>
+      <w:pPr>
+        <w:pStyle w:val="ListNumber"/>
+      </w:pPr>
+      <w:r>
+        <w:rPr>
+          <w:sz w:val="22"/>
+        </w:rPr>
+        <w:t>DTES SRO Collaborative</w:t>
+      </w:r>
+      <w:r>
+        <w:rPr>
+          <w:color w:val="777777"/>
+          <w:sz w:val="20"/>
+        </w:rPr>
+        <w:t xml:space="preserve">  —  268 Keefer St, Vancouver</w:t>
+      </w:r>
+    </w:p>
+    <w:p>
+      <w:pPr>
+        <w:pStyle w:val="ListNumber"/>
+      </w:pPr>
+      <w:r>
+        <w:rPr>
+          <w:sz w:val="22"/>
+        </w:rPr>
+        <w:t>UBC Learning Exchange</w:t>
+      </w:r>
+      <w:r>
+        <w:rPr>
+          <w:color w:val="777777"/>
+          <w:sz w:val="20"/>
+        </w:rPr>
+        <w:t xml:space="preserve">  —  612 Main St, Vancouver</w:t>
       </w:r>
     </w:p>
     <w:p>
@@ -126,6 +234,24 @@
     <w:p>
       <w:pPr>
         <w:pStyle w:val="Heading1"/>
+      </w:pPr>
+      <w:r>
+        <w:t>False Creek South, Senakw &amp; Granville Island Tour</w:t>
+      </w:r>
+    </w:p>
+    <w:p>
+      <w:r>
+        <w:rPr>
+          <w:i/>
+          <w:color w:val="555555"/>
+        </w:rPr>
+        <w:t>Seawall walking tour covering public land stewardship, Indigenous-led development, and federal property governance.</w:t>
+      </w:r>
+    </w:p>
+    <w:p/>
+    <w:p>
+      <w:pPr>
+        <w:pStyle w:val="Heading2"/>
       </w:pPr>
       <w:r>
         <w:t>Stop 1: False Creek South Community Land Trust</w:t>
@@ -228,7 +354,7 @@
     <w:p/>
     <w:p>
       <w:pPr>
-        <w:pStyle w:val="Heading2"/>
+        <w:pStyle w:val="Heading3"/>
       </w:pPr>
       <w:r>
         <w:t>Overview</w:t>
@@ -326,7 +452,7 @@
     </w:p>
     <w:p>
       <w:pPr>
-        <w:pStyle w:val="Heading2"/>
+        <w:pStyle w:val="Heading3"/>
       </w:pPr>
       <w:r>
         <w:t>At This Stop</w:t>
@@ -343,14 +469,14 @@
         <w:rPr>
           <w:b/>
         </w:rPr>
-        <w:t>Lease Renewal Timeline</w:t>
+        <w:t>Tour Start: 4th &amp; Heather Bus Stop</w:t>
       </w:r>
       <w:r>
         <w:rPr>
           <w:color w:val="777777"/>
           <w:sz w:val="18"/>
         </w:rPr>
-        <w:t xml:space="preserve">  [Decision window]</w:t>
+        <w:t xml:space="preserve">  [Starting point]</w:t>
       </w:r>
     </w:p>
     <w:p>
@@ -358,7 +484,7 @@
         <w:ind w:left="357"/>
       </w:pPr>
       <w:r>
-        <w:t>Locate the leasehold parcels expiring between 2036–2046 and discuss how renewal options affect long-term affordability.</w:t>
+        <w:t>The tour begins on the False Creek seawall near W 6th Avenue, a short walk from the W 4th Avenue and Heather Street bus stop.</w:t>
       </w:r>
     </w:p>
     <w:p>
@@ -372,14 +498,14 @@
         <w:rPr>
           <w:b/>
         </w:rPr>
-        <w:t>Co-op Cluster</w:t>
+        <w:t>Lease Renewal Timeline</w:t>
       </w:r>
       <w:r>
         <w:rPr>
           <w:color w:val="777777"/>
           <w:sz w:val="18"/>
         </w:rPr>
-        <w:t xml:space="preserve">  [Community-led]</w:t>
+        <w:t xml:space="preserve">  [Decision window]</w:t>
       </w:r>
     </w:p>
     <w:p>
@@ -387,7 +513,7 @@
         <w:ind w:left="357"/>
       </w:pPr>
       <w:r>
-        <w:t>Visit the co-op homes along the waterfront to see shared courtyards and resident-led governance in action.</w:t>
+        <w:t>Locate the leasehold parcels expiring between 2036–2046 and discuss how renewal options affect long-term affordability.</w:t>
       </w:r>
     </w:p>
     <w:p>
@@ -401,14 +527,14 @@
         <w:rPr>
           <w:b/>
         </w:rPr>
-        <w:t>Waterfront Greenway</w:t>
+        <w:t>Co-op Cluster</w:t>
       </w:r>
       <w:r>
         <w:rPr>
           <w:color w:val="777777"/>
           <w:sz w:val="18"/>
         </w:rPr>
-        <w:t xml:space="preserve">  [Public realm]</w:t>
+        <w:t xml:space="preserve">  [Community-led]</w:t>
       </w:r>
     </w:p>
     <w:p>
@@ -416,7 +542,7 @@
         <w:ind w:left="357"/>
       </w:pPr>
       <w:r>
-        <w:t>Follow the seawall to experience the public-realm improvements tied to public land stewardship.</w:t>
+        <w:t>Visit the co-op homes along the waterfront to see shared courtyards and resident-led governance in action.</w:t>
       </w:r>
     </w:p>
     <w:p>
@@ -430,13 +556,42 @@
         <w:rPr>
           <w:b/>
         </w:rPr>
-        <w:t>Housing Trust Hub</w:t>
+        <w:t>Waterfront Greenway</w:t>
       </w:r>
       <w:r>
         <w:rPr>
           <w:color w:val="777777"/>
           <w:sz w:val="18"/>
         </w:rPr>
+        <w:t xml:space="preserve">  [Public realm]</w:t>
+      </w:r>
+    </w:p>
+    <w:p>
+      <w:pPr>
+        <w:ind w:left="357"/>
+      </w:pPr>
+      <w:r>
+        <w:t>Follow the seawall to experience the public-realm improvements tied to public land stewardship.</w:t>
+      </w:r>
+    </w:p>
+    <w:p>
+      <w:r>
+        <w:rPr>
+          <w:b/>
+        </w:rPr>
+        <w:t xml:space="preserve">5. </w:t>
+      </w:r>
+      <w:r>
+        <w:rPr>
+          <w:b/>
+        </w:rPr>
+        <w:t>Housing Trust Hub</w:t>
+      </w:r>
+      <w:r>
+        <w:rPr>
+          <w:color w:val="777777"/>
+          <w:sz w:val="18"/>
+        </w:rPr>
         <w:t xml:space="preserve">  [Future planning]</w:t>
       </w:r>
     </w:p>
@@ -450,7 +605,7 @@
     </w:p>
     <w:p>
       <w:pPr>
-        <w:pStyle w:val="Heading2"/>
+        <w:pStyle w:val="Heading3"/>
       </w:pPr>
       <w:r>
         <w:t>Housing Model</w:t>
@@ -803,7 +958,7 @@
     </w:p>
     <w:p>
       <w:pPr>
-        <w:pStyle w:val="Heading2"/>
+        <w:pStyle w:val="Heading3"/>
       </w:pPr>
       <w:r>
         <w:t>Resources</w:t>
@@ -951,10 +1106,10 @@
     </w:p>
     <w:p>
       <w:pPr>
-        <w:pStyle w:val="Heading1"/>
-      </w:pPr>
-      <w:r>
-        <w:t>Stop 2: Senákw Development</w:t>
+        <w:pStyle w:val="Heading2"/>
+      </w:pPr>
+      <w:r>
+        <w:t>Stop 2: Senakw Development</w:t>
       </w:r>
     </w:p>
     <w:p>
@@ -1054,7 +1209,7 @@
     <w:p/>
     <w:p>
       <w:pPr>
-        <w:pStyle w:val="Heading2"/>
+        <w:pStyle w:val="Heading3"/>
       </w:pPr>
       <w:r>
         <w:t>Overview</w:t>
@@ -1066,7 +1221,7 @@
         <w:rPr>
           <w:b w:val="0"/>
         </w:rPr>
-        <w:t xml:space="preserve">Senákw (pronounced "sen-AHK-w") is the </w:t>
+        <w:t xml:space="preserve">Senakw (pronounced "sen-AHK-w") is the </w:t>
       </w:r>
       <w:r>
         <w:rPr>
@@ -1137,7 +1292,7 @@
     </w:p>
     <w:p>
       <w:pPr>
-        <w:pStyle w:val="Heading2"/>
+        <w:pStyle w:val="Heading3"/>
       </w:pPr>
       <w:r>
         <w:t>At This Stop</w:t>
@@ -1261,7 +1416,7 @@
     </w:p>
     <w:p>
       <w:pPr>
-        <w:pStyle w:val="Heading2"/>
+        <w:pStyle w:val="Heading3"/>
       </w:pPr>
       <w:r>
         <w:t>Land Rights</w:t>
@@ -1281,7 +1436,7 @@
         <w:rPr>
           <w:b w:val="0"/>
         </w:rPr>
-        <w:t xml:space="preserve">Senákw operates on </w:t>
+        <w:t xml:space="preserve">Senakw operates on </w:t>
       </w:r>
       <w:r>
         <w:rPr>
@@ -1302,7 +1457,7 @@
         <w:rPr>
           <w:b w:val="0"/>
         </w:rPr>
-        <w:t>Vancouver's view cones, established in 1989, identify 38 protected views from specific locations. The Senákw towers enter View Cone 20.0 (from West Broadway and Granville Street), but as reserve land, the project is not bound by these restrictions. In July 2024, Council approved major changes to the view cone policy, partly influenced by Senákw's development.</w:t>
+        <w:t>Vancouver's view cones, established in 1989, identify 38 protected views from specific locations. The Senakw towers enter View Cone 20.0 (from West Broadway and Granville Street), but as reserve land, the project is not bound by these restrictions. In July 2024, Council approved major changes to the view cone policy, partly influenced by Senakw's development.</w:t>
       </w:r>
     </w:p>
     <w:p>
@@ -1360,7 +1515,7 @@
         <w:rPr>
           <w:b w:val="0"/>
         </w:rPr>
-        <w:t xml:space="preserve">Senákw's unit mix includes </w:t>
+        <w:t xml:space="preserve">Senakw's unit mix includes </w:t>
       </w:r>
       <w:r>
         <w:rPr>
@@ -1415,7 +1570,7 @@
         <w:rPr>
           <w:b w:val="0"/>
         </w:rPr>
-        <w:t>Senákw is part of a broader movement of Indigenous nations using land development for economic self-determination:</w:t>
+        <w:t>Senakw is part of a broader movement of Indigenous nations using land development for economic self-determination:</w:t>
       </w:r>
     </w:p>
     <w:p>
@@ -1514,7 +1669,7 @@
     </w:p>
     <w:p>
       <w:pPr>
-        <w:pStyle w:val="Heading2"/>
+        <w:pStyle w:val="Heading3"/>
       </w:pPr>
       <w:r>
         <w:t>Resources</w:t>
@@ -1528,7 +1683,7 @@
         <w:rPr>
           <w:b/>
         </w:rPr>
-        <w:t>Senákw Official Website</w:t>
+        <w:t>Senakw Official Website</w:t>
       </w:r>
       <w:r>
         <w:rPr>
@@ -1555,7 +1710,7 @@
         <w:rPr>
           <w:b/>
         </w:rPr>
-        <w:t>Squamish Nation — Senákw Partnership</w:t>
+        <w:t>Squamish Nation — Senakw Partnership</w:t>
       </w:r>
       <w:r>
         <w:rPr>
@@ -1582,7 +1737,7 @@
         <w:rPr>
           <w:b/>
         </w:rPr>
-        <w:t>City of Vancouver — Senákw Development</w:t>
+        <w:t>City of Vancouver — Senakw Development</w:t>
       </w:r>
       <w:r>
         <w:rPr>
@@ -1662,7 +1817,7 @@
     </w:p>
     <w:p>
       <w:pPr>
-        <w:pStyle w:val="Heading1"/>
+        <w:pStyle w:val="Heading2"/>
       </w:pPr>
       <w:r>
         <w:t>Stop 3: Granville Island</w:t>
@@ -1765,7 +1920,7 @@
     <w:p/>
     <w:p>
       <w:pPr>
-        <w:pStyle w:val="Heading2"/>
+        <w:pStyle w:val="Heading3"/>
       </w:pPr>
       <w:r>
         <w:t>Overview</w:t>
@@ -1860,7 +2015,7 @@
     </w:p>
     <w:p>
       <w:pPr>
-        <w:pStyle w:val="Heading2"/>
+        <w:pStyle w:val="Heading3"/>
       </w:pPr>
       <w:r>
         <w:t>At This Stop</w:t>
@@ -1984,7 +2139,7 @@
     </w:p>
     <w:p>
       <w:pPr>
-        <w:pStyle w:val="Heading2"/>
+        <w:pStyle w:val="Heading3"/>
       </w:pPr>
       <w:r>
         <w:t>Land Model</w:t>
@@ -2319,7 +2474,7 @@
     </w:p>
     <w:p>
       <w:pPr>
-        <w:pStyle w:val="Heading2"/>
+        <w:pStyle w:val="Heading3"/>
       </w:pPr>
       <w:r>
         <w:t>Resources</w:t>
@@ -2470,7 +2625,7 @@
         <w:pStyle w:val="Heading1"/>
       </w:pPr>
       <w:r>
-        <w:t>Stop 4: Downtown Eastside Community Land Trust</w:t>
+        <w:t>DTES Community Organizations Tour</w:t>
       </w:r>
     </w:p>
     <w:p>
@@ -2479,7 +2634,25 @@
           <w:i/>
           <w:color w:val="555555"/>
         </w:rPr>
-        <w:t>Location: Downtown Eastside, Vancouver</w:t>
+        <w:t>Walking tour of Downtown Eastside community organizations, land trusts, and tenant advocacy groups.</w:t>
+      </w:r>
+    </w:p>
+    <w:p/>
+    <w:p>
+      <w:pPr>
+        <w:pStyle w:val="Heading2"/>
+      </w:pPr>
+      <w:r>
+        <w:t>Stop 1: Downtown Eastside Community Land Trust</w:t>
+      </w:r>
+    </w:p>
+    <w:p>
+      <w:r>
+        <w:rPr>
+          <w:i/>
+          <w:color w:val="555555"/>
+        </w:rPr>
+        <w:t>Location: 222 Keefer St, Vancouver</w:t>
       </w:r>
     </w:p>
     <w:p>
@@ -2570,7 +2743,7 @@
     <w:p/>
     <w:p>
       <w:pPr>
-        <w:pStyle w:val="Heading2"/>
+        <w:pStyle w:val="Heading3"/>
       </w:pPr>
       <w:r>
         <w:t>Overview</w:t>
@@ -2641,7 +2814,7 @@
     </w:p>
     <w:p>
       <w:pPr>
-        <w:pStyle w:val="Heading2"/>
+        <w:pStyle w:val="Heading3"/>
       </w:pPr>
       <w:r>
         <w:t>At This Stop</w:t>
@@ -2658,14 +2831,14 @@
         <w:rPr>
           <w:b/>
         </w:rPr>
-        <w:t>Carnegie Community Centre</w:t>
+        <w:t>SRO Support Loop</w:t>
       </w:r>
       <w:r>
         <w:rPr>
           <w:color w:val="777777"/>
           <w:sz w:val="18"/>
         </w:rPr>
-        <w:t xml:space="preserve">  [Community hub]</w:t>
+        <w:t xml:space="preserve">  [Support services]</w:t>
       </w:r>
     </w:p>
     <w:p>
@@ -2673,7 +2846,7 @@
         <w:ind w:left="357"/>
       </w:pPr>
       <w:r>
-        <w:t>Visit the historic centre to see wraparound services that anchor the neighbourhood.</w:t>
+        <w:t>Map the tenant support network connecting SRO buildings, outreach teams, and health resources.</w:t>
       </w:r>
     </w:p>
     <w:p>
@@ -2687,14 +2860,14 @@
         <w:rPr>
           <w:b/>
         </w:rPr>
-        <w:t>SRO Support Loop</w:t>
+        <w:t>Hogan's Alley Sites</w:t>
       </w:r>
       <w:r>
         <w:rPr>
           <w:color w:val="777777"/>
           <w:sz w:val="18"/>
         </w:rPr>
-        <w:t xml:space="preserve">  [Support services]</w:t>
+        <w:t xml:space="preserve">  [Cultural heritage]</w:t>
       </w:r>
     </w:p>
     <w:p>
@@ -2702,7 +2875,7 @@
         <w:ind w:left="357"/>
       </w:pPr>
       <w:r>
-        <w:t>Map the tenant support network connecting SRO buildings, outreach teams, and health resources.</w:t>
+        <w:t>Identify the restoration efforts honoring Vancouver's historic Black neighbourhood.</w:t>
       </w:r>
     </w:p>
     <w:p>
@@ -2716,14 +2889,14 @@
         <w:rPr>
           <w:b/>
         </w:rPr>
-        <w:t>Hogan's Alley Sites</w:t>
+        <w:t>Future Acquisitions</w:t>
       </w:r>
       <w:r>
         <w:rPr>
           <w:color w:val="777777"/>
           <w:sz w:val="18"/>
         </w:rPr>
-        <w:t xml:space="preserve">  [Cultural heritage]</w:t>
+        <w:t xml:space="preserve">  [Land trust]</w:t>
       </w:r>
     </w:p>
     <w:p>
@@ -2731,28 +2904,733 @@
         <w:ind w:left="357"/>
       </w:pPr>
       <w:r>
-        <w:t>Identify the restoration efforts honoring Vancouver’s historic Black neighbourhood.</w:t>
-      </w:r>
-    </w:p>
-    <w:p>
+        <w:t>Review the Keefer and Powell Rooms timelines to understand CLT acquisition strategy.</w:t>
+      </w:r>
+    </w:p>
+    <w:p>
+      <w:pPr>
+        <w:pStyle w:val="Heading3"/>
+      </w:pPr>
+      <w:r>
+        <w:t>Partners &amp; Work</w:t>
+      </w:r>
+    </w:p>
+    <w:p>
+      <w:pPr>
+        <w:pStyle w:val="Heading4"/>
+      </w:pPr>
+      <w:r>
+        <w:t>The SRO Challenge</w:t>
+      </w:r>
+    </w:p>
+    <w:p>
+      <w:pPr/>
+      <w:r>
+        <w:rPr>
+          <w:b w:val="0"/>
+        </w:rPr>
+        <w:t xml:space="preserve">Vancouver's SRO stock is governed by the SRA by-law, with </w:t>
+      </w:r>
       <w:r>
         <w:rPr>
           <w:b/>
         </w:rPr>
-        <w:t xml:space="preserve">4. </w:t>
+        <w:t>~99 buildings and ~4,000 rooms</w:t>
+      </w:r>
+      <w:r>
+        <w:rPr>
+          <w:b w:val="0"/>
+        </w:rPr>
+        <w:t xml:space="preserve"> in the DTES alone. Average rents are roughly </w:t>
       </w:r>
       <w:r>
         <w:rPr>
           <w:b/>
         </w:rPr>
-        <w:t>Future Acquisitions</w:t>
+        <w:t>$680/month</w:t>
+      </w:r>
+      <w:r>
+        <w:rPr>
+          <w:b w:val="0"/>
+        </w:rPr>
+        <w:t xml:space="preserve"> overall, while private SROs average closer to </w:t>
+      </w:r>
+      <w:r>
+        <w:rPr>
+          <w:b/>
+        </w:rPr>
+        <w:t>$740/month</w:t>
+      </w:r>
+      <w:r>
+        <w:rPr>
+          <w:b w:val="0"/>
+        </w:rPr>
+        <w:t>. The provincial shelter rate is $500/month, creating a persistent affordability gap.</w:t>
+      </w:r>
+    </w:p>
+    <w:p>
+      <w:pPr/>
+      <w:r>
+        <w:rPr>
+          <w:b w:val="0"/>
+        </w:rPr>
+        <w:t xml:space="preserve">As </w:t>
+      </w:r>
+      <w:r>
+        <w:rPr>
+          <w:b/>
+        </w:rPr>
+        <w:t>Wendy Pedersen</w:t>
+      </w:r>
+      <w:r>
+        <w:rPr>
+          <w:b w:val="0"/>
+        </w:rPr>
+        <w:t>, Executive Director of the SRO Collaborative, explains: "Privately owned SRO hotels are a last resort before homelessness." The Collaborative's Tenant Overdose Response Organizers (TORO) project connects tenant organizers with naloxone supplies and education.</w:t>
+      </w:r>
+    </w:p>
+    <w:p>
+      <w:pPr>
+        <w:pStyle w:val="Heading4"/>
+      </w:pPr>
+      <w:r>
+        <w:t>Community Partners</w:t>
+      </w:r>
+    </w:p>
+    <w:p>
+      <w:pPr/>
+      <w:r>
+        <w:rPr>
+          <w:b w:val="0"/>
+        </w:rPr>
+        <w:t>Multiple organizations work together to preserve and improve DTES housing:</w:t>
+      </w:r>
+    </w:p>
+    <w:p>
+      <w:pPr>
+        <w:pStyle w:val="ListBullet"/>
+      </w:pPr>
+      <w:r>
+        <w:rPr>
+          <w:b/>
+        </w:rPr>
+        <w:t>DTES SRO Collaborative:</w:t>
+      </w:r>
+      <w:r>
+        <w:rPr>
+          <w:b w:val="0"/>
+        </w:rPr>
+        <w:t xml:space="preserve"> Advocates for tenants, received $11M provincial grant in 2023</w:t>
+      </w:r>
+    </w:p>
+    <w:p>
+      <w:pPr>
+        <w:pStyle w:val="ListBullet"/>
+      </w:pPr>
+      <w:r>
+        <w:rPr>
+          <w:b/>
+        </w:rPr>
+        <w:t>Hogan's Alley Society:</w:t>
+      </w:r>
+      <w:r>
+        <w:rPr>
+          <w:b w:val="0"/>
+        </w:rPr>
+        <w:t xml:space="preserve"> Restoring Vancouver's historic Black neighbourhood, with projects on Union Street and Main Street</w:t>
+      </w:r>
+    </w:p>
+    <w:p>
+      <w:pPr>
+        <w:pStyle w:val="ListBullet"/>
+      </w:pPr>
+      <w:r>
+        <w:rPr>
+          <w:b/>
+        </w:rPr>
+        <w:t>Aboriginal Front Door:</w:t>
+      </w:r>
+      <w:r>
+        <w:rPr>
+          <w:b w:val="0"/>
+        </w:rPr>
+        <w:t xml:space="preserve"> Indigenous-led support services</w:t>
+      </w:r>
+    </w:p>
+    <w:p>
+      <w:pPr>
+        <w:pStyle w:val="ListBullet"/>
+      </w:pPr>
+      <w:r>
+        <w:rPr>
+          <w:b/>
+        </w:rPr>
+        <w:t>Carnegie Community Centre:</w:t>
+      </w:r>
+      <w:r>
+        <w:rPr>
+          <w:b w:val="0"/>
+        </w:rPr>
+        <w:t xml:space="preserve"> Historic community hub since 1903</w:t>
+      </w:r>
+    </w:p>
+    <w:p>
+      <w:pPr>
+        <w:pStyle w:val="ListBullet"/>
+      </w:pPr>
+      <w:r>
+        <w:rPr>
+          <w:b/>
+        </w:rPr>
+        <w:t>DTES Neighbourhood House:</w:t>
+      </w:r>
+      <w:r>
+        <w:rPr>
+          <w:b w:val="0"/>
+        </w:rPr>
+        <w:t xml:space="preserve"> Community programs and partnerships</w:t>
+      </w:r>
+    </w:p>
+    <w:p>
+      <w:pPr>
+        <w:pStyle w:val="ListBullet"/>
+      </w:pPr>
+      <w:r>
+        <w:rPr>
+          <w:b/>
+        </w:rPr>
+        <w:t>UBC Learning Exchange:</w:t>
+      </w:r>
+      <w:r>
+        <w:rPr>
+          <w:b w:val="0"/>
+        </w:rPr>
+        <w:t xml:space="preserve"> University-community partnership</w:t>
+      </w:r>
+    </w:p>
+    <w:p>
+      <w:pPr>
+        <w:pStyle w:val="Heading4"/>
+      </w:pPr>
+      <w:r>
+        <w:t>Community Land Trust Model</w:t>
+      </w:r>
+    </w:p>
+    <w:p>
+      <w:pPr/>
+      <w:r>
+        <w:rPr>
+          <w:b w:val="0"/>
+        </w:rPr>
+        <w:t>The CLT approach in the DTES:</w:t>
+      </w:r>
+    </w:p>
+    <w:p>
+      <w:pPr>
+        <w:pStyle w:val="ListBullet"/>
+      </w:pPr>
+      <w:r>
+        <w:rPr>
+          <w:b w:val="0"/>
+        </w:rPr>
+        <w:t>Removes buildings permanently from the speculative market</w:t>
+      </w:r>
+    </w:p>
+    <w:p>
+      <w:pPr>
+        <w:pStyle w:val="ListBullet"/>
+      </w:pPr>
+      <w:r>
+        <w:rPr>
+          <w:b w:val="0"/>
+        </w:rPr>
+        <w:t>Ensures long-term affordability through trust structure</w:t>
+      </w:r>
+    </w:p>
+    <w:p>
+      <w:pPr>
+        <w:pStyle w:val="ListBullet"/>
+      </w:pPr>
+      <w:r>
+        <w:rPr>
+          <w:b w:val="0"/>
+        </w:rPr>
+        <w:t>Keeps housing decisions in community hands</w:t>
+      </w:r>
+    </w:p>
+    <w:p>
+      <w:pPr>
+        <w:pStyle w:val="ListBullet"/>
+      </w:pPr>
+      <w:r>
+        <w:rPr>
+          <w:b w:val="0"/>
+        </w:rPr>
+        <w:t>Prevents displacement of current residents during acquisition</w:t>
+      </w:r>
+    </w:p>
+    <w:p>
+      <w:pPr>
+        <w:pStyle w:val="Heading4"/>
+      </w:pPr>
+      <w:r>
+        <w:t>Policy Context</w:t>
+      </w:r>
+    </w:p>
+    <w:p>
+      <w:pPr/>
+      <w:r>
+        <w:rPr>
+          <w:b w:val="0"/>
+        </w:rPr>
+        <w:t xml:space="preserve">In 2024, Vancouver implemented </w:t>
+      </w:r>
+      <w:r>
+        <w:rPr>
+          <w:b/>
+        </w:rPr>
+        <w:t>vacancy control for SROs</w:t>
+      </w:r>
+      <w:r>
+        <w:rPr>
+          <w:b w:val="0"/>
+        </w:rPr>
+        <w:t xml:space="preserve">, preventing rent spikes between tenancies. DTES CLT's first acquisition, </w:t>
+      </w:r>
+      <w:r>
+        <w:rPr>
+          <w:b/>
+        </w:rPr>
+        <w:t>Powell Rooms (23 units)</w:t>
+      </w:r>
+      <w:r>
+        <w:rPr>
+          <w:b w:val="0"/>
+        </w:rPr>
+        <w:t xml:space="preserve">, is expected to close in January 2026, while </w:t>
+      </w:r>
+      <w:r>
+        <w:rPr>
+          <w:b/>
+        </w:rPr>
+        <w:t>Keefer Rooms (48 units)</w:t>
+      </w:r>
+      <w:r>
+        <w:rPr>
+          <w:b w:val="0"/>
+        </w:rPr>
+        <w:t xml:space="preserve"> is reopening in spring 2025 through a BC Housing partnership and community programming model.</w:t>
+      </w:r>
+    </w:p>
+    <w:p/>
+    <w:p>
+      <w:r>
+        <w:rPr>
+          <w:b/>
+          <w:sz w:val="22"/>
+        </w:rPr>
+        <w:t>Key Points</w:t>
+      </w:r>
+    </w:p>
+    <w:p>
+      <w:pPr>
+        <w:pStyle w:val="ListBullet"/>
+      </w:pPr>
+      <w:r>
+        <w:t>4,000+ residents in ~99 SROs — last stop before homelessness</w:t>
+      </w:r>
+    </w:p>
+    <w:p>
+      <w:pPr>
+        <w:pStyle w:val="ListBullet"/>
+      </w:pPr>
+      <w:r>
+        <w:t>$11M provincial grant to SRO Collaborative (2023)</w:t>
+      </w:r>
+    </w:p>
+    <w:p>
+      <w:pPr>
+        <w:pStyle w:val="ListBullet"/>
+      </w:pPr>
+      <w:r>
+        <w:t>CLT acquisitions remove buildings from speculative market</w:t>
+      </w:r>
+    </w:p>
+    <w:p>
+      <w:pPr>
+        <w:pStyle w:val="ListBullet"/>
+      </w:pPr>
+      <w:r>
+        <w:t>Vacancy control (2024) prevents rent hikes between tenancies</w:t>
+      </w:r>
+    </w:p>
+    <w:p>
+      <w:pPr>
+        <w:pStyle w:val="Heading3"/>
+      </w:pPr>
+      <w:r>
+        <w:t>Resources</w:t>
+      </w:r>
+    </w:p>
+    <w:p>
+      <w:pPr>
+        <w:pStyle w:val="ListBullet"/>
+      </w:pPr>
+      <w:r>
+        <w:rPr>
+          <w:b/>
+        </w:rPr>
+        <w:t>DTES SRO Collaborative</w:t>
+      </w:r>
+      <w:r>
+        <w:rPr>
+          <w:color w:val="4466AA"/>
+          <w:sz w:val="18"/>
+        </w:rPr>
+        <w:br/>
+        <w:t>https://srocollaborative.org/</w:t>
+      </w:r>
+      <w:r>
+        <w:rPr>
+          <w:color w:val="666666"/>
+          <w:sz w:val="20"/>
+        </w:rPr>
+        <w:br/>
+        <w:t>Tenant advocacy and support organization</w:t>
+      </w:r>
+    </w:p>
+    <w:p>
+      <w:pPr>
+        <w:pStyle w:val="ListBullet"/>
+      </w:pPr>
+      <w:r>
+        <w:rPr>
+          <w:b/>
+        </w:rPr>
+        <w:t>DTES Neighbourhood House — SRO Collaborative Profile</w:t>
+      </w:r>
+      <w:r>
+        <w:rPr>
+          <w:color w:val="4466AA"/>
+          <w:sz w:val="18"/>
+        </w:rPr>
+        <w:br/>
+        <w:t>https://www.dtesnhouse.ca/news-updates/partner-feature-sro-collaborative</w:t>
+      </w:r>
+      <w:r>
+        <w:rPr>
+          <w:color w:val="666666"/>
+          <w:sz w:val="20"/>
+        </w:rPr>
+        <w:br/>
+        <w:t>Background on the SRO Collaborative's work</w:t>
+      </w:r>
+    </w:p>
+    <w:p>
+      <w:pPr>
+        <w:pStyle w:val="ListBullet"/>
+      </w:pPr>
+      <w:r>
+        <w:rPr>
+          <w:b/>
+        </w:rPr>
+        <w:t>Downtown Eastside Community Land Trust</w:t>
+      </w:r>
+      <w:r>
+        <w:rPr>
+          <w:color w:val="4466AA"/>
+          <w:sz w:val="18"/>
+        </w:rPr>
+        <w:br/>
+        <w:t>https://www.dtescommunitylandtrust.ca/</w:t>
+      </w:r>
+      <w:r>
+        <w:rPr>
+          <w:color w:val="666666"/>
+          <w:sz w:val="20"/>
+        </w:rPr>
+        <w:br/>
+        <w:t>Community land trust leadership and acquisition model in the DTES</w:t>
+      </w:r>
+    </w:p>
+    <w:p>
+      <w:pPr>
+        <w:pStyle w:val="ListBullet"/>
+      </w:pPr>
+      <w:r>
+        <w:rPr>
+          <w:b/>
+        </w:rPr>
+        <w:t>SRO Collaborative Programs</w:t>
+      </w:r>
+      <w:r>
+        <w:rPr>
+          <w:color w:val="4466AA"/>
+          <w:sz w:val="18"/>
+        </w:rPr>
+        <w:br/>
+        <w:t>https://srocollaborative.org/programs/</w:t>
+      </w:r>
+      <w:r>
+        <w:rPr>
+          <w:color w:val="666666"/>
+          <w:sz w:val="20"/>
+        </w:rPr>
+        <w:br/>
+        <w:t>Tenant organizing, peer supports, and SRO-focused program directory</w:t>
+      </w:r>
+    </w:p>
+    <w:p>
+      <w:pPr>
+        <w:pStyle w:val="ListBullet"/>
+      </w:pPr>
+      <w:r>
+        <w:rPr>
+          <w:b/>
+        </w:rPr>
+        <w:t>Hogan's Alley Society</w:t>
+      </w:r>
+      <w:r>
+        <w:rPr>
+          <w:color w:val="4466AA"/>
+          <w:sz w:val="18"/>
+        </w:rPr>
+        <w:br/>
+        <w:t>https://www.hogansalleysociety.org/</w:t>
+      </w:r>
+      <w:r>
+        <w:rPr>
+          <w:color w:val="666666"/>
+          <w:sz w:val="20"/>
+        </w:rPr>
+        <w:br/>
+        <w:t>Restoring Vancouver's historic Black community</w:t>
+      </w:r>
+    </w:p>
+    <w:p>
+      <w:r>
+        <w:br w:type="page"/>
+      </w:r>
+    </w:p>
+    <w:p>
+      <w:pPr>
+        <w:pStyle w:val="Heading2"/>
+      </w:pPr>
+      <w:r>
+        <w:t>Stop 2: First United Church</w:t>
+      </w:r>
+    </w:p>
+    <w:p>
+      <w:r>
+        <w:rPr>
+          <w:i/>
+          <w:color w:val="555555"/>
+        </w:rPr>
+        <w:t>Location: 320 E Hastings St, Vancouver</w:t>
+      </w:r>
+    </w:p>
+    <w:p>
+      <w:pPr>
+        <w:pStyle w:val="Heading3"/>
+      </w:pPr>
+      <w:r>
+        <w:t>Quick Facts</w:t>
+      </w:r>
+    </w:p>
+    <w:tbl>
+      <w:tblPr>
+        <w:tblW w:type="auto" w:w="0"/>
+        <w:jc w:val="left"/>
+        <w:tblLook w:firstColumn="1" w:firstRow="1" w:lastColumn="0" w:lastRow="0" w:noHBand="0" w:noVBand="1" w:val="04A0"/>
+      </w:tblPr>
+      <w:tblGrid>
+        <w:gridCol w:w="3120"/>
+        <w:gridCol w:w="3120"/>
+        <w:gridCol w:w="3120"/>
+      </w:tblGrid>
+      <w:tr>
+        <w:tc>
+          <w:tcPr>
+            <w:tcW w:type="dxa" w:w="3120"/>
+          </w:tcPr>
+          <w:p>
+            <w:r>
+              <w:rPr>
+                <w:color w:val="555555"/>
+                <w:sz w:val="20"/>
+              </w:rPr>
+              <w:t xml:space="preserve">Founded: </w:t>
+            </w:r>
+            <w:r>
+              <w:rPr>
+                <w:b/>
+                <w:sz w:val="22"/>
+              </w:rPr>
+              <w:t>1886</w:t>
+            </w:r>
+          </w:p>
+        </w:tc>
+        <w:tc>
+          <w:tcPr>
+            <w:tcW w:type="dxa" w:w="3120"/>
+          </w:tcPr>
+          <w:p>
+            <w:r>
+              <w:rPr>
+                <w:color w:val="555555"/>
+                <w:sz w:val="20"/>
+              </w:rPr>
+              <w:t xml:space="preserve">Safe Shelter: </w:t>
+            </w:r>
+            <w:r>
+              <w:rPr>
+                <w:b/>
+                <w:sz w:val="22"/>
+              </w:rPr>
+              <w:t>51 beds</w:t>
+            </w:r>
+          </w:p>
+        </w:tc>
+        <w:tc>
+          <w:tcPr>
+            <w:tcW w:type="dxa" w:w="3120"/>
+          </w:tcPr>
+          <w:p>
+            <w:r>
+              <w:rPr>
+                <w:color w:val="555555"/>
+                <w:sz w:val="20"/>
+              </w:rPr>
+              <w:t xml:space="preserve">Legal Cases: </w:t>
+            </w:r>
+            <w:r>
+              <w:rPr>
+                <w:b/>
+                <w:sz w:val="22"/>
+              </w:rPr>
+              <w:t>1,400+/yr</w:t>
+            </w:r>
+          </w:p>
+        </w:tc>
+      </w:tr>
+    </w:tbl>
+    <w:p/>
+    <w:p>
+      <w:pPr>
+        <w:pStyle w:val="Heading3"/>
+      </w:pPr>
+      <w:r>
+        <w:t>Overview</w:t>
+      </w:r>
+    </w:p>
+    <w:p>
+      <w:pPr/>
+      <w:r>
+        <w:rPr>
+          <w:b/>
+        </w:rPr>
+        <w:t>FIRST UNITED</w:t>
+      </w:r>
+      <w:r>
+        <w:rPr>
+          <w:b w:val="0"/>
+        </w:rPr>
+        <w:t xml:space="preserve"> has worked in Vancouver's Downtown Eastside since 1886. Today it combines shelter, legal advocacy, and community food programs in one service model focused on reducing harm and preventing homelessness.</w:t>
+      </w:r>
+    </w:p>
+    <w:p>
+      <w:pPr/>
+      <w:r>
+        <w:rPr>
+          <w:b w:val="0"/>
+        </w:rPr>
+        <w:t xml:space="preserve">Its Safe Shelter program currently operates </w:t>
+      </w:r>
+      <w:r>
+        <w:rPr>
+          <w:b/>
+        </w:rPr>
+        <w:t>51 low-barrier shelter beds</w:t>
+      </w:r>
+      <w:r>
+        <w:rPr>
+          <w:b w:val="0"/>
+        </w:rPr>
+        <w:t xml:space="preserve"> at 467 Alexander Street. The Legal Advocacy program supports tenants and income-security clients and reports </w:t>
+      </w:r>
+      <w:r>
+        <w:rPr>
+          <w:b/>
+        </w:rPr>
+        <w:t>more than 1,400 unique cases each year</w:t>
+      </w:r>
+      <w:r>
+        <w:rPr>
+          <w:b w:val="0"/>
+        </w:rPr>
+        <w:t>.</w:t>
+      </w:r>
+    </w:p>
+    <w:p>
+      <w:pPr/>
+      <w:r>
+        <w:rPr>
+          <w:b w:val="0"/>
+        </w:rPr>
+        <w:t xml:space="preserve">The organization is also leading a major redevelopment at 320 East Hastings with partner </w:t>
+      </w:r>
+      <w:r>
+        <w:rPr>
+          <w:b/>
+        </w:rPr>
+        <w:t>Lu'ma Native BCH Housing Society</w:t>
+      </w:r>
+      <w:r>
+        <w:rPr>
+          <w:b w:val="0"/>
+        </w:rPr>
+        <w:t xml:space="preserve">, planned to include </w:t>
+      </w:r>
+      <w:r>
+        <w:rPr>
+          <w:b/>
+        </w:rPr>
+        <w:t>100+ homes and roughly 40,000 sq ft</w:t>
+      </w:r>
+      <w:r>
+        <w:rPr>
+          <w:b w:val="0"/>
+        </w:rPr>
+        <w:t xml:space="preserve"> of community-serving space.</w:t>
+      </w:r>
+    </w:p>
+    <w:p>
+      <w:pPr>
+        <w:pStyle w:val="Heading3"/>
+      </w:pPr>
+      <w:r>
+        <w:t>At This Stop</w:t>
+      </w:r>
+    </w:p>
+    <w:p>
+      <w:r>
+        <w:rPr>
+          <w:b/>
+        </w:rPr>
+        <w:t xml:space="preserve">1. </w:t>
+      </w:r>
+      <w:r>
+        <w:rPr>
+          <w:b/>
+        </w:rPr>
+        <w:t>Safe Shelter Program</w:t>
       </w:r>
       <w:r>
         <w:rPr>
           <w:color w:val="777777"/>
           <w:sz w:val="18"/>
         </w:rPr>
-        <w:t xml:space="preserve">  [Land trust]</w:t>
+        <w:t xml:space="preserve">  [Shelter]</w:t>
       </w:r>
     </w:p>
     <w:p>
@@ -2760,15 +3638,102 @@
         <w:ind w:left="357"/>
       </w:pPr>
       <w:r>
-        <w:t>Review the Keefer and Powell Rooms timelines to understand CLT acquisition strategy.</w:t>
-      </w:r>
-    </w:p>
-    <w:p>
-      <w:pPr>
-        <w:pStyle w:val="Heading2"/>
-      </w:pPr>
-      <w:r>
-        <w:t>Partners &amp; Work</w:t>
+        <w:t>Review how the 51-bed low-barrier shelter supports people facing immediate housing instability.</w:t>
+      </w:r>
+    </w:p>
+    <w:p>
+      <w:r>
+        <w:rPr>
+          <w:b/>
+        </w:rPr>
+        <w:t xml:space="preserve">2. </w:t>
+      </w:r>
+      <w:r>
+        <w:rPr>
+          <w:b/>
+        </w:rPr>
+        <w:t>Legal Advocacy</w:t>
+      </w:r>
+      <w:r>
+        <w:rPr>
+          <w:color w:val="777777"/>
+          <w:sz w:val="18"/>
+        </w:rPr>
+        <w:t xml:space="preserve">  [Tenant rights]</w:t>
+      </w:r>
+    </w:p>
+    <w:p>
+      <w:pPr>
+        <w:ind w:left="357"/>
+      </w:pPr>
+      <w:r>
+        <w:t>Understand tenancy, social assistance, and disability advocacy support delivered at street level.</w:t>
+      </w:r>
+    </w:p>
+    <w:p>
+      <w:r>
+        <w:rPr>
+          <w:b/>
+        </w:rPr>
+        <w:t xml:space="preserve">3. </w:t>
+      </w:r>
+      <w:r>
+        <w:rPr>
+          <w:b/>
+        </w:rPr>
+        <w:t>Food Access</w:t>
+      </w:r>
+      <w:r>
+        <w:rPr>
+          <w:color w:val="777777"/>
+          <w:sz w:val="18"/>
+        </w:rPr>
+        <w:t xml:space="preserve">  [Food security]</w:t>
+      </w:r>
+    </w:p>
+    <w:p>
+      <w:pPr>
+        <w:ind w:left="357"/>
+      </w:pPr>
+      <w:r>
+        <w:t>Track meal services including daily lunch and outreach food truck operations.</w:t>
+      </w:r>
+    </w:p>
+    <w:p>
+      <w:r>
+        <w:rPr>
+          <w:b/>
+        </w:rPr>
+        <w:t xml:space="preserve">4. </w:t>
+      </w:r>
+      <w:r>
+        <w:rPr>
+          <w:b/>
+        </w:rPr>
+        <w:t>Redevelopment Site</w:t>
+      </w:r>
+      <w:r>
+        <w:rPr>
+          <w:color w:val="777777"/>
+          <w:sz w:val="18"/>
+        </w:rPr>
+        <w:t xml:space="preserve">  [Housing delivery]</w:t>
+      </w:r>
+    </w:p>
+    <w:p>
+      <w:pPr>
+        <w:ind w:left="357"/>
+      </w:pPr>
+      <w:r>
+        <w:t>Connect the current site to plans for long-term affordable homes and integrated community space.</w:t>
+      </w:r>
+    </w:p>
+    <w:p>
+      <w:pPr>
+        <w:pStyle w:val="Heading3"/>
+      </w:pPr>
+      <w:r>
+        <w:t>Programs</w:t>
       </w:r>
     </w:p>
     <w:p>
@@ -2776,7 +3741,7 @@
         <w:pStyle w:val="Heading4"/>
       </w:pPr>
       <w:r>
-        <w:t>The SRO Challenge</w:t>
+        <w:t>Core Programs</w:t>
       </w:r>
     </w:p>
     <w:p>
@@ -2785,43 +3750,66 @@
         <w:rPr>
           <w:b w:val="0"/>
         </w:rPr>
-        <w:t xml:space="preserve">Vancouver's SRO stock is governed by the SRA by-law, with </w:t>
-      </w:r>
+        <w:t>FIRST UNITED's front-line model combines shelter, legal support, and food access:</w:t>
+      </w:r>
+    </w:p>
+    <w:p>
+      <w:pPr>
+        <w:pStyle w:val="ListBullet"/>
+      </w:pPr>
       <w:r>
         <w:rPr>
           <w:b/>
         </w:rPr>
-        <w:t>~99 buildings and ~4,000 rooms</w:t>
+        <w:t>Safe Shelter:</w:t>
       </w:r>
       <w:r>
         <w:rPr>
           <w:b w:val="0"/>
         </w:rPr>
-        <w:t xml:space="preserve"> in the DTES alone. Average rents are roughly </w:t>
-      </w:r>
+        <w:t xml:space="preserve"> 51 low-barrier beds currently operating at 467 Alexander Street</w:t>
+      </w:r>
+    </w:p>
+    <w:p>
+      <w:pPr>
+        <w:pStyle w:val="ListBullet"/>
+      </w:pPr>
       <w:r>
         <w:rPr>
           <w:b/>
         </w:rPr>
-        <w:t>$680/month</w:t>
+        <w:t>Legal Advocacy:</w:t>
       </w:r>
       <w:r>
         <w:rPr>
           <w:b w:val="0"/>
         </w:rPr>
-        <w:t xml:space="preserve"> overall, while private SROs average closer to </w:t>
-      </w:r>
+        <w:t xml:space="preserve"> more than 1,400 unique client cases annually focused on tenancy and income rights</w:t>
+      </w:r>
+    </w:p>
+    <w:p>
+      <w:pPr>
+        <w:pStyle w:val="ListBullet"/>
+      </w:pPr>
       <w:r>
         <w:rPr>
           <w:b/>
         </w:rPr>
-        <w:t>$740/month</w:t>
+        <w:t>Food Programs:</w:t>
       </w:r>
       <w:r>
         <w:rPr>
           <w:b w:val="0"/>
         </w:rPr>
-        <w:t>. The provincial shelter rate is $500/month, creating a persistent affordability gap.</w:t>
+        <w:t xml:space="preserve"> daily meal services, lunch distribution, and a mobile food truck</w:t>
+      </w:r>
+    </w:p>
+    <w:p>
+      <w:pPr>
+        <w:pStyle w:val="Heading4"/>
+      </w:pPr>
+      <w:r>
+        <w:t>Redevelopment at 320 E Hastings</w:t>
       </w:r>
     </w:p>
     <w:p>
@@ -2830,252 +3818,16 @@
         <w:rPr>
           <w:b w:val="0"/>
         </w:rPr>
-        <w:t xml:space="preserve">As </w:t>
-      </w:r>
-      <w:r>
-        <w:rPr>
-          <w:b/>
-        </w:rPr>
-        <w:t>Wendy Pedersen</w:t>
-      </w:r>
+        <w:t>The redevelopment project is designed to preserve FIRST UNITED's service base while adding permanent housing supply. Public project materials describe a mixed-use community hub with 100+ homes and approximately 40,000 sq ft for social, cultural, and health-serving uses.</w:t>
+      </w:r>
+    </w:p>
+    <w:p>
+      <w:pPr/>
       <w:r>
         <w:rPr>
           <w:b w:val="0"/>
         </w:rPr>
-        <w:t>, Executive Director of the SRO Collaborative, explains: "Privately owned SRO hotels are a last resort before homelessness." The Collaborative's Tenant Overdose Response Organizers (TORO) project connects tenant organizers with naloxone supplies and education.</w:t>
-      </w:r>
-    </w:p>
-    <w:p>
-      <w:pPr>
-        <w:pStyle w:val="Heading4"/>
-      </w:pPr>
-      <w:r>
-        <w:t>Community Partners</w:t>
-      </w:r>
-    </w:p>
-    <w:p>
-      <w:pPr/>
-      <w:r>
-        <w:rPr>
-          <w:b w:val="0"/>
-        </w:rPr>
-        <w:t>Multiple organizations work together to preserve and improve DTES housing:</w:t>
-      </w:r>
-    </w:p>
-    <w:p>
-      <w:pPr>
-        <w:pStyle w:val="ListBullet"/>
-      </w:pPr>
-      <w:r>
-        <w:rPr>
-          <w:b/>
-        </w:rPr>
-        <w:t>DTES SRO Collaborative:</w:t>
-      </w:r>
-      <w:r>
-        <w:rPr>
-          <w:b w:val="0"/>
-        </w:rPr>
-        <w:t xml:space="preserve"> Advocates for tenants, received $11M provincial grant in 2023</w:t>
-      </w:r>
-    </w:p>
-    <w:p>
-      <w:pPr>
-        <w:pStyle w:val="ListBullet"/>
-      </w:pPr>
-      <w:r>
-        <w:rPr>
-          <w:b/>
-        </w:rPr>
-        <w:t>Hogan's Alley Society:</w:t>
-      </w:r>
-      <w:r>
-        <w:rPr>
-          <w:b w:val="0"/>
-        </w:rPr>
-        <w:t xml:space="preserve"> Restoring Vancouver's historic Black neighbourhood, with projects on Union Street and Main Street</w:t>
-      </w:r>
-    </w:p>
-    <w:p>
-      <w:pPr>
-        <w:pStyle w:val="ListBullet"/>
-      </w:pPr>
-      <w:r>
-        <w:rPr>
-          <w:b/>
-        </w:rPr>
-        <w:t>Aboriginal Front Door:</w:t>
-      </w:r>
-      <w:r>
-        <w:rPr>
-          <w:b w:val="0"/>
-        </w:rPr>
-        <w:t xml:space="preserve"> Indigenous-led support services</w:t>
-      </w:r>
-    </w:p>
-    <w:p>
-      <w:pPr>
-        <w:pStyle w:val="ListBullet"/>
-      </w:pPr>
-      <w:r>
-        <w:rPr>
-          <w:b/>
-        </w:rPr>
-        <w:t>Carnegie Community Centre:</w:t>
-      </w:r>
-      <w:r>
-        <w:rPr>
-          <w:b w:val="0"/>
-        </w:rPr>
-        <w:t xml:space="preserve"> Historic community hub since 1903</w:t>
-      </w:r>
-    </w:p>
-    <w:p>
-      <w:pPr>
-        <w:pStyle w:val="ListBullet"/>
-      </w:pPr>
-      <w:r>
-        <w:rPr>
-          <w:b/>
-        </w:rPr>
-        <w:t>DTES Neighbourhood House:</w:t>
-      </w:r>
-      <w:r>
-        <w:rPr>
-          <w:b w:val="0"/>
-        </w:rPr>
-        <w:t xml:space="preserve"> Community programs and partnerships</w:t>
-      </w:r>
-    </w:p>
-    <w:p>
-      <w:pPr>
-        <w:pStyle w:val="ListBullet"/>
-      </w:pPr>
-      <w:r>
-        <w:rPr>
-          <w:b/>
-        </w:rPr>
-        <w:t>UBC Learning Exchange:</w:t>
-      </w:r>
-      <w:r>
-        <w:rPr>
-          <w:b w:val="0"/>
-        </w:rPr>
-        <w:t xml:space="preserve"> University-community partnership</w:t>
-      </w:r>
-    </w:p>
-    <w:p>
-      <w:pPr>
-        <w:pStyle w:val="Heading4"/>
-      </w:pPr>
-      <w:r>
-        <w:t>Community Land Trust Model</w:t>
-      </w:r>
-    </w:p>
-    <w:p>
-      <w:pPr/>
-      <w:r>
-        <w:rPr>
-          <w:b w:val="0"/>
-        </w:rPr>
-        <w:t>The CLT approach in the DTES:</w:t>
-      </w:r>
-    </w:p>
-    <w:p>
-      <w:pPr>
-        <w:pStyle w:val="ListBullet"/>
-      </w:pPr>
-      <w:r>
-        <w:rPr>
-          <w:b w:val="0"/>
-        </w:rPr>
-        <w:t>Removes buildings permanently from the speculative market</w:t>
-      </w:r>
-    </w:p>
-    <w:p>
-      <w:pPr>
-        <w:pStyle w:val="ListBullet"/>
-      </w:pPr>
-      <w:r>
-        <w:rPr>
-          <w:b w:val="0"/>
-        </w:rPr>
-        <w:t>Ensures long-term affordability through trust structure</w:t>
-      </w:r>
-    </w:p>
-    <w:p>
-      <w:pPr>
-        <w:pStyle w:val="ListBullet"/>
-      </w:pPr>
-      <w:r>
-        <w:rPr>
-          <w:b w:val="0"/>
-        </w:rPr>
-        <w:t>Keeps housing decisions in community hands</w:t>
-      </w:r>
-    </w:p>
-    <w:p>
-      <w:pPr>
-        <w:pStyle w:val="ListBullet"/>
-      </w:pPr>
-      <w:r>
-        <w:rPr>
-          <w:b w:val="0"/>
-        </w:rPr>
-        <w:t>Prevents displacement of current residents during acquisition</w:t>
-      </w:r>
-    </w:p>
-    <w:p>
-      <w:pPr>
-        <w:pStyle w:val="Heading4"/>
-      </w:pPr>
-      <w:r>
-        <w:t>Policy Context</w:t>
-      </w:r>
-    </w:p>
-    <w:p>
-      <w:pPr/>
-      <w:r>
-        <w:rPr>
-          <w:b w:val="0"/>
-        </w:rPr>
-        <w:t xml:space="preserve">In 2024, Vancouver implemented </w:t>
-      </w:r>
-      <w:r>
-        <w:rPr>
-          <w:b/>
-        </w:rPr>
-        <w:t>vacancy control for SROs</w:t>
-      </w:r>
-      <w:r>
-        <w:rPr>
-          <w:b w:val="0"/>
-        </w:rPr>
-        <w:t xml:space="preserve">, preventing rent spikes between tenancies. DTES CLT's first acquisition, </w:t>
-      </w:r>
-      <w:r>
-        <w:rPr>
-          <w:b/>
-        </w:rPr>
-        <w:t>Powell Rooms (23 units)</w:t>
-      </w:r>
-      <w:r>
-        <w:rPr>
-          <w:b w:val="0"/>
-        </w:rPr>
-        <w:t xml:space="preserve">, is expected to close in January 2026, while </w:t>
-      </w:r>
-      <w:r>
-        <w:rPr>
-          <w:b/>
-        </w:rPr>
-        <w:t>Keefer Rooms (48 units)</w:t>
-      </w:r>
-      <w:r>
-        <w:rPr>
-          <w:b w:val="0"/>
-        </w:rPr>
-        <w:t xml:space="preserve"> is reopening in spring 2025 through a BC Housing partnership and community programming model.</w:t>
+        <w:t>The project partnership with Lu'ma Native BCH Housing Society also sets out Indigenous-led and community-accountable governance outcomes for long-term operations.</w:t>
       </w:r>
     </w:p>
     <w:p/>
@@ -3093,7 +3845,7 @@
         <w:pStyle w:val="ListBullet"/>
       </w:pPr>
       <w:r>
-        <w:t>4,000+ residents in ~99 SROs — last stop before homelessness</w:t>
+        <w:t>Operating in the DTES since 1886</w:t>
       </w:r>
     </w:p>
     <w:p>
@@ -3101,7 +3853,7 @@
         <w:pStyle w:val="ListBullet"/>
       </w:pPr>
       <w:r>
-        <w:t>$11M provincial grant to SRO Collaborative (2023)</w:t>
+        <w:t>51 low-barrier shelter beds at the current safe shelter site</w:t>
       </w:r>
     </w:p>
     <w:p>
@@ -3109,7 +3861,7 @@
         <w:pStyle w:val="ListBullet"/>
       </w:pPr>
       <w:r>
-        <w:t>CLT acquisitions remove buildings from speculative market</w:t>
+        <w:t>1,400+ legal advocacy cases each year</w:t>
       </w:r>
     </w:p>
     <w:p>
@@ -3117,12 +3869,12 @@
         <w:pStyle w:val="ListBullet"/>
       </w:pPr>
       <w:r>
-        <w:t>Vacancy control (2024) prevents rent hikes between tenancies</w:t>
-      </w:r>
-    </w:p>
-    <w:p>
-      <w:pPr>
-        <w:pStyle w:val="Heading2"/>
+        <w:t>320 E Hastings redevelopment targets 100+ homes</w:t>
+      </w:r>
+    </w:p>
+    <w:p>
+      <w:pPr>
+        <w:pStyle w:val="Heading3"/>
       </w:pPr>
       <w:r>
         <w:t>Resources</w:t>
@@ -3136,7 +3888,7 @@
         <w:rPr>
           <w:b/>
         </w:rPr>
-        <w:t>DTES SRO Collaborative</w:t>
+        <w:t>First United Church</w:t>
       </w:r>
       <w:r>
         <w:rPr>
@@ -3144,7 +3896,7 @@
           <w:sz w:val="18"/>
         </w:rPr>
         <w:br/>
-        <w:t>https://srocollaborative.org/</w:t>
+        <w:t>https://firstunited.ca/</w:t>
       </w:r>
       <w:r>
         <w:rPr>
@@ -3152,7 +3904,7 @@
           <w:sz w:val="20"/>
         </w:rPr>
         <w:br/>
-        <w:t>Tenant advocacy and support organization</w:t>
+        <w:t>Official organization website</w:t>
       </w:r>
     </w:p>
     <w:p>
@@ -3163,7 +3915,7 @@
         <w:rPr>
           <w:b/>
         </w:rPr>
-        <w:t>DTES Neighbourhood House — SRO Collaborative Profile</w:t>
+        <w:t>Safe Shelter</w:t>
       </w:r>
       <w:r>
         <w:rPr>
@@ -3171,7 +3923,7 @@
           <w:sz w:val="18"/>
         </w:rPr>
         <w:br/>
-        <w:t>https://www.dtesnhouse.ca/news-updates/partner-feature-sro-collaborative</w:t>
+        <w:t>https://firstunited.ca/how-we-help/safe-shelter/</w:t>
       </w:r>
       <w:r>
         <w:rPr>
@@ -3179,7 +3931,7 @@
           <w:sz w:val="20"/>
         </w:rPr>
         <w:br/>
-        <w:t>Background on the SRO Collaborative's work</w:t>
+        <w:t>Current low-barrier shelter program details</w:t>
       </w:r>
     </w:p>
     <w:p>
@@ -3190,7 +3942,7 @@
         <w:rPr>
           <w:b/>
         </w:rPr>
-        <w:t>Vancouver Community Land Trust Foundation</w:t>
+        <w:t>Legal Advocacy</w:t>
       </w:r>
       <w:r>
         <w:rPr>
@@ -3198,7 +3950,7 @@
           <w:sz w:val="18"/>
         </w:rPr>
         <w:br/>
-        <w:t>https://www.vcltf.ca/</w:t>
+        <w:t>https://firstunited.ca/how-we-help/legal-advocacy/</w:t>
       </w:r>
       <w:r>
         <w:rPr>
@@ -3206,7 +3958,7 @@
           <w:sz w:val="20"/>
         </w:rPr>
         <w:br/>
-        <w:t>Regional community land trust organization</w:t>
+        <w:t>Tenancy and income advocacy services</w:t>
       </w:r>
     </w:p>
     <w:p>
@@ -3217,7 +3969,7 @@
         <w:rPr>
           <w:b/>
         </w:rPr>
-        <w:t>Right to Remain Research Collective</w:t>
+        <w:t>Redevelopment of FIRST UNITED</w:t>
       </w:r>
       <w:r>
         <w:rPr>
@@ -3225,7 +3977,7 @@
           <w:sz w:val="18"/>
         </w:rPr>
         <w:br/>
-        <w:t>https://www.righttoremain.ca/</w:t>
+        <w:t>https://firstunited.ca/first-forward-redevelopment/</w:t>
       </w:r>
       <w:r>
         <w:rPr>
@@ -3233,7 +3985,7 @@
           <w:sz w:val="20"/>
         </w:rPr>
         <w:br/>
-        <w:t>SRO histories and tenant stories</w:t>
+        <w:t>320 E Hastings redevelopment plan</w:t>
       </w:r>
     </w:p>
     <w:p>
@@ -3244,7 +3996,7 @@
         <w:rPr>
           <w:b/>
         </w:rPr>
-        <w:t>Hogan's Alley Society</w:t>
+        <w:t>Food Security Programs</w:t>
       </w:r>
       <w:r>
         <w:rPr>
@@ -3252,7 +4004,7 @@
           <w:sz w:val="18"/>
         </w:rPr>
         <w:br/>
-        <w:t>https://www.hogansalleysociety.org/</w:t>
+        <w:t>https://firstunited.ca/how-we-help/food-security/</w:t>
       </w:r>
       <w:r>
         <w:rPr>
@@ -3260,7 +4012,1741 @@
           <w:sz w:val="20"/>
         </w:rPr>
         <w:br/>
+        <w:t>Meal access and food outreach programs</w:t>
+      </w:r>
+    </w:p>
+    <w:p>
+      <w:r>
+        <w:br w:type="page"/>
+      </w:r>
+    </w:p>
+    <w:p>
+      <w:pPr>
+        <w:pStyle w:val="Heading2"/>
+      </w:pPr>
+      <w:r>
+        <w:t>Stop 3: Hogan's Alley Society</w:t>
+      </w:r>
+    </w:p>
+    <w:p>
+      <w:r>
+        <w:rPr>
+          <w:i/>
+          <w:color w:val="555555"/>
+        </w:rPr>
+        <w:t>Location: Union Street &amp; Main Street, Vancouver</w:t>
+      </w:r>
+    </w:p>
+    <w:p>
+      <w:pPr>
+        <w:pStyle w:val="Heading3"/>
+      </w:pPr>
+      <w:r>
+        <w:t>Quick Facts</w:t>
+      </w:r>
+    </w:p>
+    <w:tbl>
+      <w:tblPr>
+        <w:tblW w:type="auto" w:w="0"/>
+        <w:jc w:val="left"/>
+        <w:tblLook w:firstColumn="1" w:firstRow="1" w:lastColumn="0" w:lastRow="0" w:noHBand="0" w:noVBand="1" w:val="04A0"/>
+      </w:tblPr>
+      <w:tblGrid>
+        <w:gridCol w:w="3120"/>
+        <w:gridCol w:w="3120"/>
+        <w:gridCol w:w="3120"/>
+      </w:tblGrid>
+      <w:tr>
+        <w:tc>
+          <w:tcPr>
+            <w:tcW w:type="dxa" w:w="3120"/>
+          </w:tcPr>
+          <w:p>
+            <w:r>
+              <w:rPr>
+                <w:color w:val="555555"/>
+                <w:sz w:val="20"/>
+              </w:rPr>
+              <w:t xml:space="preserve">Historic Era: </w:t>
+            </w:r>
+            <w:r>
+              <w:rPr>
+                <w:b/>
+                <w:sz w:val="22"/>
+              </w:rPr>
+              <w:t>1935-67</w:t>
+            </w:r>
+          </w:p>
+        </w:tc>
+        <w:tc>
+          <w:tcPr>
+            <w:tcW w:type="dxa" w:w="3120"/>
+          </w:tcPr>
+          <w:p>
+            <w:r>
+              <w:rPr>
+                <w:color w:val="555555"/>
+                <w:sz w:val="20"/>
+              </w:rPr>
+              <w:t xml:space="preserve">Focus: </w:t>
+            </w:r>
+            <w:r>
+              <w:rPr>
+                <w:b/>
+                <w:sz w:val="22"/>
+              </w:rPr>
+              <w:t>Black history</w:t>
+            </w:r>
+          </w:p>
+        </w:tc>
+        <w:tc>
+          <w:tcPr>
+            <w:tcW w:type="dxa" w:w="3120"/>
+          </w:tcPr>
+          <w:p>
+            <w:r>
+              <w:rPr>
+                <w:color w:val="555555"/>
+                <w:sz w:val="20"/>
+              </w:rPr>
+              <w:t xml:space="preserve">Nora Hendrix: </w:t>
+            </w:r>
+            <w:r>
+              <w:rPr>
+                <w:b/>
+                <w:sz w:val="22"/>
+              </w:rPr>
+              <w:t>52 homes</w:t>
+            </w:r>
+          </w:p>
+        </w:tc>
+      </w:tr>
+    </w:tbl>
+    <w:p/>
+    <w:p>
+      <w:pPr>
+        <w:pStyle w:val="Heading3"/>
+      </w:pPr>
+      <w:r>
+        <w:t>Overview</w:t>
+      </w:r>
+    </w:p>
+    <w:p>
+      <w:pPr/>
+      <w:r>
+        <w:rPr>
+          <w:b/>
+        </w:rPr>
+        <w:t>Hogan's Alley</w:t>
+      </w:r>
+      <w:r>
+        <w:rPr>
+          <w:b w:val="0"/>
+        </w:rPr>
+        <w:t xml:space="preserve"> was the historic centre of Vancouver's Black community until the area was cleared during viaduct-era urban renewal. The Hogan's Alley Society (HAS) is a Black-led non-profit focused on cultural repair, anti-displacement work, and community-owned development.</w:t>
+      </w:r>
+    </w:p>
+    <w:p>
+      <w:pPr/>
+      <w:r>
+        <w:rPr>
+          <w:b w:val="0"/>
+        </w:rPr>
+        <w:t xml:space="preserve">HAS and the City of Vancouver signed a formal </w:t>
+      </w:r>
+      <w:r>
+        <w:rPr>
+          <w:b/>
+        </w:rPr>
+        <w:t>Memorandum of Understanding in September 2022</w:t>
+      </w:r>
+      <w:r>
+        <w:rPr>
+          <w:b w:val="0"/>
+        </w:rPr>
+        <w:t xml:space="preserve"> to guide a Hogan's Alley Land Trust and long-term planning in Northeast False Creek.</w:t>
+      </w:r>
+    </w:p>
+    <w:p>
+      <w:pPr/>
+      <w:r>
+        <w:rPr>
+          <w:b w:val="0"/>
+        </w:rPr>
+        <w:t xml:space="preserve">Current projects include </w:t>
+      </w:r>
+      <w:r>
+        <w:rPr>
+          <w:b/>
+        </w:rPr>
+        <w:t>Nora Hendrix Place</w:t>
+      </w:r>
+      <w:r>
+        <w:rPr>
+          <w:b w:val="0"/>
+        </w:rPr>
+        <w:t xml:space="preserve"> at 258 Union Street, a 52-home temporary modular housing project that includes culturally informed supports and onsite services.</w:t>
+      </w:r>
+    </w:p>
+    <w:p>
+      <w:pPr>
+        <w:pStyle w:val="Heading3"/>
+      </w:pPr>
+      <w:r>
+        <w:t>At This Stop</w:t>
+      </w:r>
+    </w:p>
+    <w:p>
+      <w:r>
+        <w:rPr>
+          <w:b/>
+        </w:rPr>
+        <w:t xml:space="preserve">1. </w:t>
+      </w:r>
+      <w:r>
+        <w:rPr>
+          <w:b/>
+        </w:rPr>
+        <w:t>Historic Site</w:t>
+      </w:r>
+      <w:r>
+        <w:rPr>
+          <w:color w:val="777777"/>
+          <w:sz w:val="18"/>
+        </w:rPr>
+        <w:t xml:space="preserve">  [Heritage]</w:t>
+      </w:r>
+    </w:p>
+    <w:p>
+      <w:pPr>
+        <w:ind w:left="357"/>
+      </w:pPr>
+      <w:r>
+        <w:t>Walk the former alley footprint and connect present blocks to erased Black community history.</w:t>
+      </w:r>
+    </w:p>
+    <w:p>
+      <w:r>
+        <w:rPr>
+          <w:b/>
+        </w:rPr>
+        <w:t xml:space="preserve">2. </w:t>
+      </w:r>
+      <w:r>
+        <w:rPr>
+          <w:b/>
+        </w:rPr>
+        <w:t>Nora Hendrix Place</w:t>
+      </w:r>
+      <w:r>
+        <w:rPr>
+          <w:color w:val="777777"/>
+          <w:sz w:val="18"/>
+        </w:rPr>
+        <w:t xml:space="preserve">  [Housing]</w:t>
+      </w:r>
+    </w:p>
+    <w:p>
+      <w:pPr>
+        <w:ind w:left="357"/>
+      </w:pPr>
+      <w:r>
+        <w:t>Review the 52-home project named for Jimi Hendrix's grandmother and its support model.</w:t>
+      </w:r>
+    </w:p>
+    <w:p>
+      <w:r>
+        <w:rPr>
+          <w:b/>
+        </w:rPr>
+        <w:t xml:space="preserve">3. </w:t>
+      </w:r>
+      <w:r>
+        <w:rPr>
+          <w:b/>
+        </w:rPr>
+        <w:t>Cultural Programming</w:t>
+      </w:r>
+      <w:r>
+        <w:rPr>
+          <w:color w:val="777777"/>
+          <w:sz w:val="18"/>
+        </w:rPr>
+        <w:t xml:space="preserve">  [Culture]</w:t>
+      </w:r>
+    </w:p>
+    <w:p>
+      <w:pPr>
+        <w:ind w:left="357"/>
+      </w:pPr>
+      <w:r>
+        <w:t>Explore Black cultural programming, storytelling, and place-keeping led by HAS.</w:t>
+      </w:r>
+    </w:p>
+    <w:p>
+      <w:r>
+        <w:rPr>
+          <w:b/>
+        </w:rPr>
+        <w:t xml:space="preserve">4. </w:t>
+      </w:r>
+      <w:r>
+        <w:rPr>
+          <w:b/>
+        </w:rPr>
+        <w:t>Future Development</w:t>
+      </w:r>
+      <w:r>
+        <w:rPr>
+          <w:color w:val="777777"/>
+          <w:sz w:val="18"/>
+        </w:rPr>
+        <w:t xml:space="preserve">  [Planning]</w:t>
+      </w:r>
+    </w:p>
+    <w:p>
+      <w:pPr>
+        <w:ind w:left="357"/>
+      </w:pPr>
+      <w:r>
+        <w:t>Track land trust and redevelopment planning tied to the Northeast False Creek process.</w:t>
+      </w:r>
+    </w:p>
+    <w:p>
+      <w:pPr>
+        <w:pStyle w:val="Heading3"/>
+      </w:pPr>
+      <w:r>
+        <w:t>History &amp; Plans</w:t>
+      </w:r>
+    </w:p>
+    <w:p>
+      <w:pPr>
+        <w:pStyle w:val="Heading4"/>
+      </w:pPr>
+      <w:r>
+        <w:t>Historical Context</w:t>
+      </w:r>
+    </w:p>
+    <w:p>
+      <w:pPr/>
+      <w:r>
+        <w:rPr>
+          <w:b w:val="0"/>
+        </w:rPr>
+        <w:t>Hogan's Alley became a cultural anchor for Black life in Vancouver through the mid-20th century. City documents now identify the district as a major site of displacement connected to viaduct-era planning decisions.</w:t>
+      </w:r>
+    </w:p>
+    <w:p>
+      <w:pPr>
+        <w:pStyle w:val="Heading4"/>
+      </w:pPr>
+      <w:r>
+        <w:t>Current Housing and Land Work</w:t>
+      </w:r>
+    </w:p>
+    <w:p>
+      <w:pPr/>
+      <w:r>
+        <w:rPr>
+          <w:b w:val="0"/>
+        </w:rPr>
+        <w:t>HAS is advancing housing and cultural infrastructure through a land trust approach. The Society's planning framework highlights affordable rental housing, childcare, support for Black-owned businesses, and dedicated cultural space.</w:t>
+      </w:r>
+    </w:p>
+    <w:p>
+      <w:pPr>
+        <w:pStyle w:val="Heading4"/>
+      </w:pPr>
+      <w:r>
+        <w:t>Nora Hendrix Place</w:t>
+      </w:r>
+    </w:p>
+    <w:p>
+      <w:pPr/>
+      <w:r>
+        <w:rPr>
+          <w:b w:val="0"/>
+        </w:rPr>
+        <w:t>At 258 Union Street, Nora Hendrix Place delivers 52 temporary modular homes with private kitchens and washrooms, with a minimum accessibility target and culturally grounded support services.</w:t>
+      </w:r>
+    </w:p>
+    <w:p>
+      <w:pPr>
+        <w:pStyle w:val="Heading4"/>
+      </w:pPr>
+      <w:r>
+        <w:t>Municipal Partnership</w:t>
+      </w:r>
+    </w:p>
+    <w:p>
+      <w:pPr/>
+      <w:r>
+        <w:rPr>
+          <w:b w:val="0"/>
+        </w:rPr>
+        <w:t>The City-HAS MOU (2022) sets a formal basis for co-development and governance conversations in Northeast False Creek as the viaduct removal area is rebuilt.</w:t>
+      </w:r>
+    </w:p>
+    <w:p>
+      <w:pPr>
+        <w:pStyle w:val="ListBullet"/>
+      </w:pPr>
+      <w:r>
+        <w:rPr>
+          <w:b w:val="0"/>
+        </w:rPr>
+        <w:t>Black-led community governance in project planning</w:t>
+      </w:r>
+    </w:p>
+    <w:p>
+      <w:pPr>
+        <w:pStyle w:val="ListBullet"/>
+      </w:pPr>
+      <w:r>
+        <w:rPr>
+          <w:b w:val="0"/>
+        </w:rPr>
+        <w:t>Housing, childcare, and enterprise space as linked anti-displacement tools</w:t>
+      </w:r>
+    </w:p>
+    <w:p>
+      <w:pPr>
+        <w:pStyle w:val="ListBullet"/>
+      </w:pPr>
+      <w:r>
+        <w:rPr>
+          <w:b w:val="0"/>
+        </w:rPr>
+        <w:t>Cultural redress integrated into redevelopment decisions</w:t>
+      </w:r>
+    </w:p>
+    <w:p/>
+    <w:p>
+      <w:r>
+        <w:rPr>
+          <w:b/>
+          <w:sz w:val="22"/>
+        </w:rPr>
+        <w:t>Key Points</w:t>
+      </w:r>
+    </w:p>
+    <w:p>
+      <w:pPr>
+        <w:pStyle w:val="ListBullet"/>
+      </w:pPr>
+      <w:r>
+        <w:t>Historic heart of Vancouver's Black community</w:t>
+      </w:r>
+    </w:p>
+    <w:p>
+      <w:pPr>
+        <w:pStyle w:val="ListBullet"/>
+      </w:pPr>
+      <w:r>
+        <w:t>City and HAS signed an MOU in September 2022</w:t>
+      </w:r>
+    </w:p>
+    <w:p>
+      <w:pPr>
+        <w:pStyle w:val="ListBullet"/>
+      </w:pPr>
+      <w:r>
+        <w:t>Nora Hendrix Place provides 52 modular homes</w:t>
+      </w:r>
+    </w:p>
+    <w:p>
+      <w:pPr>
+        <w:pStyle w:val="ListBullet"/>
+      </w:pPr>
+      <w:r>
+        <w:t>Land trust model ties housing with cultural redress</w:t>
+      </w:r>
+    </w:p>
+    <w:p>
+      <w:pPr>
+        <w:pStyle w:val="Heading3"/>
+      </w:pPr>
+      <w:r>
+        <w:t>Resources</w:t>
+      </w:r>
+    </w:p>
+    <w:p>
+      <w:pPr>
+        <w:pStyle w:val="ListBullet"/>
+      </w:pPr>
+      <w:r>
+        <w:rPr>
+          <w:b/>
+        </w:rPr>
+        <w:t>Hogan's Alley Society</w:t>
+      </w:r>
+      <w:r>
+        <w:rPr>
+          <w:color w:val="4466AA"/>
+          <w:sz w:val="18"/>
+        </w:rPr>
+        <w:br/>
+        <w:t>https://www.hogansalleysociety.org/</w:t>
+      </w:r>
+      <w:r>
+        <w:rPr>
+          <w:color w:val="666666"/>
+          <w:sz w:val="20"/>
+        </w:rPr>
+        <w:br/>
         <w:t>Restoring Vancouver's historic Black community</w:t>
+      </w:r>
+    </w:p>
+    <w:p>
+      <w:pPr>
+        <w:pStyle w:val="ListBullet"/>
+      </w:pPr>
+      <w:r>
+        <w:rPr>
+          <w:b/>
+        </w:rPr>
+        <w:t>Hogan's Alley Society - About</w:t>
+      </w:r>
+      <w:r>
+        <w:rPr>
+          <w:color w:val="4466AA"/>
+          <w:sz w:val="18"/>
+        </w:rPr>
+        <w:br/>
+        <w:t>https://www.hogansalleysociety.org/aboutus</w:t>
+      </w:r>
+      <w:r>
+        <w:rPr>
+          <w:color w:val="666666"/>
+          <w:sz w:val="20"/>
+        </w:rPr>
+        <w:br/>
+        <w:t>Organization history, MOU context, and project pillars</w:t>
+      </w:r>
+    </w:p>
+    <w:p>
+      <w:pPr>
+        <w:pStyle w:val="ListBullet"/>
+      </w:pPr>
+      <w:r>
+        <w:rPr>
+          <w:b/>
+        </w:rPr>
+        <w:t>City of Vancouver - Hogan's Alley Society Block</w:t>
+      </w:r>
+      <w:r>
+        <w:rPr>
+          <w:color w:val="4466AA"/>
+          <w:sz w:val="18"/>
+        </w:rPr>
+        <w:br/>
+        <w:t>https://vancouver.ca/home-property-development/hogans-alley-society-block.aspx</w:t>
+      </w:r>
+      <w:r>
+        <w:rPr>
+          <w:color w:val="666666"/>
+          <w:sz w:val="20"/>
+        </w:rPr>
+        <w:br/>
+        <w:t>Municipal planning and implementation details</w:t>
+      </w:r>
+    </w:p>
+    <w:p>
+      <w:pPr>
+        <w:pStyle w:val="ListBullet"/>
+      </w:pPr>
+      <w:r>
+        <w:rPr>
+          <w:b/>
+        </w:rPr>
+        <w:t>City of Vancouver - 258 Union Street</w:t>
+      </w:r>
+      <w:r>
+        <w:rPr>
+          <w:color w:val="4466AA"/>
+          <w:sz w:val="18"/>
+        </w:rPr>
+        <w:br/>
+        <w:t>https://vancouver.ca/people-programs/258-union-street.aspx</w:t>
+      </w:r>
+      <w:r>
+        <w:rPr>
+          <w:color w:val="666666"/>
+          <w:sz w:val="20"/>
+        </w:rPr>
+        <w:br/>
+        <w:t>Nora Hendrix Place housing project profile</w:t>
+      </w:r>
+    </w:p>
+    <w:p>
+      <w:r>
+        <w:br w:type="page"/>
+      </w:r>
+    </w:p>
+    <w:p>
+      <w:pPr>
+        <w:pStyle w:val="Heading2"/>
+      </w:pPr>
+      <w:r>
+        <w:t>Stop 4: DTES SRO Collaborative</w:t>
+      </w:r>
+    </w:p>
+    <w:p>
+      <w:r>
+        <w:rPr>
+          <w:i/>
+          <w:color w:val="555555"/>
+        </w:rPr>
+        <w:t>Location: 268 Keefer St, Vancouver</w:t>
+      </w:r>
+    </w:p>
+    <w:p>
+      <w:pPr>
+        <w:pStyle w:val="Heading3"/>
+      </w:pPr>
+      <w:r>
+        <w:t>Quick Facts</w:t>
+      </w:r>
+    </w:p>
+    <w:tbl>
+      <w:tblPr>
+        <w:tblW w:type="auto" w:w="0"/>
+        <w:jc w:val="left"/>
+        <w:tblLook w:firstColumn="1" w:firstRow="1" w:lastColumn="0" w:lastRow="0" w:noHBand="0" w:noVBand="1" w:val="04A0"/>
+      </w:tblPr>
+      <w:tblGrid>
+        <w:gridCol w:w="3120"/>
+        <w:gridCol w:w="3120"/>
+        <w:gridCol w:w="3120"/>
+      </w:tblGrid>
+      <w:tr>
+        <w:tc>
+          <w:tcPr>
+            <w:tcW w:type="dxa" w:w="3120"/>
+          </w:tcPr>
+          <w:p>
+            <w:r>
+              <w:rPr>
+                <w:color w:val="555555"/>
+                <w:sz w:val="20"/>
+              </w:rPr>
+              <w:t xml:space="preserve">Provincial Grant: </w:t>
+            </w:r>
+            <w:r>
+              <w:rPr>
+                <w:b/>
+                <w:sz w:val="22"/>
+              </w:rPr>
+              <w:t>$11M</w:t>
+            </w:r>
+          </w:p>
+        </w:tc>
+        <w:tc>
+          <w:tcPr>
+            <w:tcW w:type="dxa" w:w="3120"/>
+          </w:tcPr>
+          <w:p>
+            <w:r>
+              <w:rPr>
+                <w:color w:val="555555"/>
+                <w:sz w:val="20"/>
+              </w:rPr>
+              <w:t xml:space="preserve">Focus: </w:t>
+            </w:r>
+            <w:r>
+              <w:rPr>
+                <w:b/>
+                <w:sz w:val="22"/>
+              </w:rPr>
+              <w:t>Tenant advocacy</w:t>
+            </w:r>
+          </w:p>
+        </w:tc>
+        <w:tc>
+          <w:tcPr>
+            <w:tcW w:type="dxa" w:w="3120"/>
+          </w:tcPr>
+          <w:p>
+            <w:r>
+              <w:rPr>
+                <w:color w:val="555555"/>
+                <w:sz w:val="20"/>
+              </w:rPr>
+              <w:t xml:space="preserve">Program: </w:t>
+            </w:r>
+            <w:r>
+              <w:rPr>
+                <w:b/>
+                <w:sz w:val="22"/>
+              </w:rPr>
+              <w:t>TORO</w:t>
+            </w:r>
+          </w:p>
+        </w:tc>
+      </w:tr>
+    </w:tbl>
+    <w:p/>
+    <w:p>
+      <w:pPr>
+        <w:pStyle w:val="Heading3"/>
+      </w:pPr>
+      <w:r>
+        <w:t>Overview</w:t>
+      </w:r>
+    </w:p>
+    <w:p>
+      <w:pPr/>
+      <w:r>
+        <w:rPr>
+          <w:b w:val="0"/>
+        </w:rPr>
+        <w:t xml:space="preserve">The </w:t>
+      </w:r>
+      <w:r>
+        <w:rPr>
+          <w:b/>
+        </w:rPr>
+        <w:t>DTES SRO Collaborative Society</w:t>
+      </w:r>
+      <w:r>
+        <w:rPr>
+          <w:b w:val="0"/>
+        </w:rPr>
+        <w:t xml:space="preserve"> is a tenant-led organization focused on resident safety, tenancy rights, and policy change in privately owned SRO hotels.</w:t>
+      </w:r>
+    </w:p>
+    <w:p>
+      <w:pPr/>
+      <w:r>
+        <w:rPr>
+          <w:b w:val="0"/>
+        </w:rPr>
+        <w:t xml:space="preserve">Its </w:t>
+      </w:r>
+      <w:r>
+        <w:rPr>
+          <w:b/>
+        </w:rPr>
+        <w:t>Tenant Overdose Response Organizers (TORO)</w:t>
+      </w:r>
+      <w:r>
+        <w:rPr>
+          <w:b w:val="0"/>
+        </w:rPr>
+        <w:t xml:space="preserve"> initiative is active in around 40 private SRO hotels and supports residents through overdose prevention education, naloxone access, and peer organizing.</w:t>
+      </w:r>
+    </w:p>
+    <w:p>
+      <w:pPr/>
+      <w:r>
+        <w:rPr>
+          <w:b w:val="0"/>
+        </w:rPr>
+        <w:t xml:space="preserve">In 2023, the Province of British Columbia announced a </w:t>
+      </w:r>
+      <w:r>
+        <w:rPr>
+          <w:b/>
+        </w:rPr>
+        <w:t>one-time $11 million grant</w:t>
+      </w:r>
+      <w:r>
+        <w:rPr>
+          <w:b w:val="0"/>
+        </w:rPr>
+        <w:t xml:space="preserve"> to support tenant-led safety and stabilization work in the DTES. The Collaborative also co-led a 2024 tenant survey project with community partners and the City.</w:t>
+      </w:r>
+    </w:p>
+    <w:p>
+      <w:pPr>
+        <w:pStyle w:val="Heading3"/>
+      </w:pPr>
+      <w:r>
+        <w:t>At This Stop</w:t>
+      </w:r>
+    </w:p>
+    <w:p>
+      <w:r>
+        <w:rPr>
+          <w:b/>
+        </w:rPr>
+        <w:t xml:space="preserve">1. </w:t>
+      </w:r>
+      <w:r>
+        <w:rPr>
+          <w:b/>
+        </w:rPr>
+        <w:t>Tenant Organizing</w:t>
+      </w:r>
+      <w:r>
+        <w:rPr>
+          <w:color w:val="777777"/>
+          <w:sz w:val="18"/>
+        </w:rPr>
+        <w:t xml:space="preserve">  [Advocacy]</w:t>
+      </w:r>
+    </w:p>
+    <w:p>
+      <w:pPr>
+        <w:ind w:left="357"/>
+      </w:pPr>
+      <w:r>
+        <w:t>Learn about tenant-led organizing and advocacy strategies.</w:t>
+      </w:r>
+    </w:p>
+    <w:p>
+      <w:r>
+        <w:rPr>
+          <w:b/>
+        </w:rPr>
+        <w:t xml:space="preserve">2. </w:t>
+      </w:r>
+      <w:r>
+        <w:rPr>
+          <w:b/>
+        </w:rPr>
+        <w:t>TORO Program</w:t>
+      </w:r>
+      <w:r>
+        <w:rPr>
+          <w:color w:val="777777"/>
+          <w:sz w:val="18"/>
+        </w:rPr>
+        <w:t xml:space="preserve">  [Harm reduction]</w:t>
+      </w:r>
+    </w:p>
+    <w:p>
+      <w:pPr>
+        <w:ind w:left="357"/>
+      </w:pPr>
+      <w:r>
+        <w:t>Understand the Tenant Overdose Response Organizers initiative.</w:t>
+      </w:r>
+    </w:p>
+    <w:p>
+      <w:r>
+        <w:rPr>
+          <w:b/>
+        </w:rPr>
+        <w:t xml:space="preserve">3. </w:t>
+      </w:r>
+      <w:r>
+        <w:rPr>
+          <w:b/>
+        </w:rPr>
+        <w:t>SRO Conditions</w:t>
+      </w:r>
+      <w:r>
+        <w:rPr>
+          <w:color w:val="777777"/>
+          <w:sz w:val="18"/>
+        </w:rPr>
+        <w:t xml:space="preserve">  [Housing]</w:t>
+      </w:r>
+    </w:p>
+    <w:p>
+      <w:pPr>
+        <w:ind w:left="357"/>
+      </w:pPr>
+      <w:r>
+        <w:t>Discuss challenges and opportunities in SRO housing.</w:t>
+      </w:r>
+    </w:p>
+    <w:p>
+      <w:r>
+        <w:rPr>
+          <w:b/>
+        </w:rPr>
+        <w:t xml:space="preserve">4. </w:t>
+      </w:r>
+      <w:r>
+        <w:rPr>
+          <w:b/>
+        </w:rPr>
+        <w:t>Policy Impact</w:t>
+      </w:r>
+      <w:r>
+        <w:rPr>
+          <w:color w:val="777777"/>
+          <w:sz w:val="18"/>
+        </w:rPr>
+        <w:t xml:space="preserve">  [Policy]</w:t>
+      </w:r>
+    </w:p>
+    <w:p>
+      <w:pPr>
+        <w:ind w:left="357"/>
+      </w:pPr>
+      <w:r>
+        <w:t>Review the Collaborative's role in vacancy control policy.</w:t>
+      </w:r>
+    </w:p>
+    <w:p>
+      <w:pPr>
+        <w:pStyle w:val="Heading3"/>
+      </w:pPr>
+      <w:r>
+        <w:t>Programs</w:t>
+      </w:r>
+    </w:p>
+    <w:p>
+      <w:pPr>
+        <w:pStyle w:val="Heading4"/>
+      </w:pPr>
+      <w:r>
+        <w:t>How the Collaborative Works</w:t>
+      </w:r>
+    </w:p>
+    <w:p>
+      <w:pPr/>
+      <w:r>
+        <w:rPr>
+          <w:b w:val="0"/>
+        </w:rPr>
+        <w:t>The organization describes tenant committees as a core accountability structure. These committees identify building-level issues, connect residents to legal and health supports, and coordinate local safety planning.</w:t>
+      </w:r>
+    </w:p>
+    <w:p>
+      <w:pPr>
+        <w:pStyle w:val="Heading4"/>
+      </w:pPr>
+      <w:r>
+        <w:t>TORO Program</w:t>
+      </w:r>
+    </w:p>
+    <w:p>
+      <w:pPr/>
+      <w:r>
+        <w:rPr>
+          <w:b w:val="0"/>
+        </w:rPr>
+        <w:t>TORO is designed as a tenant-led overdose response and harm-reduction model within SRO buildings. The program focuses on peer leadership and direct supply access to reduce preventable deaths.</w:t>
+      </w:r>
+    </w:p>
+    <w:p>
+      <w:pPr>
+        <w:pStyle w:val="Heading4"/>
+      </w:pPr>
+      <w:r>
+        <w:t>Policy and Public Accountability</w:t>
+      </w:r>
+    </w:p>
+    <w:p>
+      <w:pPr/>
+      <w:r>
+        <w:rPr>
+          <w:b w:val="0"/>
+        </w:rPr>
+        <w:t>Recent efforts include coordinated tenant surveys and public documentation of SRO living conditions, helping shape city and provincial conversations on minimum standards, rent protections, and anti-displacement policy.</w:t>
+      </w:r>
+    </w:p>
+    <w:p>
+      <w:pPr>
+        <w:pStyle w:val="Heading4"/>
+      </w:pPr>
+      <w:r>
+        <w:t>Funding Context</w:t>
+      </w:r>
+    </w:p>
+    <w:p>
+      <w:pPr/>
+      <w:r>
+        <w:rPr>
+          <w:b w:val="0"/>
+        </w:rPr>
+        <w:t>The 2023 provincial grant provides targeted support for tenant-led operations, outreach, and staffing for services tied to safety and stabilization in the private SRO stock.</w:t>
+      </w:r>
+    </w:p>
+    <w:p>
+      <w:pPr>
+        <w:pStyle w:val="ListBullet"/>
+      </w:pPr>
+      <w:r>
+        <w:rPr>
+          <w:b w:val="0"/>
+        </w:rPr>
+        <w:t>Resident-led governance through tenant committees</w:t>
+      </w:r>
+    </w:p>
+    <w:p>
+      <w:pPr>
+        <w:pStyle w:val="ListBullet"/>
+      </w:pPr>
+      <w:r>
+        <w:rPr>
+          <w:b w:val="0"/>
+        </w:rPr>
+        <w:t>Harm reduction and overdose response capacity in SRO hotels</w:t>
+      </w:r>
+    </w:p>
+    <w:p>
+      <w:pPr>
+        <w:pStyle w:val="ListBullet"/>
+      </w:pPr>
+      <w:r>
+        <w:rPr>
+          <w:b w:val="0"/>
+        </w:rPr>
+        <w:t>Cross-partner survey and policy evidence gathering</w:t>
+      </w:r>
+    </w:p>
+    <w:p/>
+    <w:p>
+      <w:r>
+        <w:rPr>
+          <w:b/>
+          <w:sz w:val="22"/>
+        </w:rPr>
+        <w:t>Key Points</w:t>
+      </w:r>
+    </w:p>
+    <w:p>
+      <w:pPr>
+        <w:pStyle w:val="ListBullet"/>
+      </w:pPr>
+      <w:r>
+        <w:t>Tenant-led advocacy organization</w:t>
+      </w:r>
+    </w:p>
+    <w:p>
+      <w:pPr>
+        <w:pStyle w:val="ListBullet"/>
+      </w:pPr>
+      <w:r>
+        <w:t>$11M provincial grant (2023)</w:t>
+      </w:r>
+    </w:p>
+    <w:p>
+      <w:pPr>
+        <w:pStyle w:val="ListBullet"/>
+      </w:pPr>
+      <w:r>
+        <w:t>TORO active in around 40 private SRO hotels</w:t>
+      </w:r>
+    </w:p>
+    <w:p>
+      <w:pPr>
+        <w:pStyle w:val="ListBullet"/>
+      </w:pPr>
+      <w:r>
+        <w:t>2024 tenant survey work with city and community partners</w:t>
+      </w:r>
+    </w:p>
+    <w:p>
+      <w:pPr>
+        <w:pStyle w:val="Heading3"/>
+      </w:pPr>
+      <w:r>
+        <w:t>Resources</w:t>
+      </w:r>
+    </w:p>
+    <w:p>
+      <w:pPr>
+        <w:pStyle w:val="ListBullet"/>
+      </w:pPr>
+      <w:r>
+        <w:rPr>
+          <w:b/>
+        </w:rPr>
+        <w:t>DTES SRO Collaborative</w:t>
+      </w:r>
+      <w:r>
+        <w:rPr>
+          <w:color w:val="4466AA"/>
+          <w:sz w:val="18"/>
+        </w:rPr>
+        <w:br/>
+        <w:t>https://srocollaborative.org/</w:t>
+      </w:r>
+      <w:r>
+        <w:rPr>
+          <w:color w:val="666666"/>
+          <w:sz w:val="20"/>
+        </w:rPr>
+        <w:br/>
+        <w:t>Tenant advocacy and support organization</w:t>
+      </w:r>
+    </w:p>
+    <w:p>
+      <w:pPr>
+        <w:pStyle w:val="ListBullet"/>
+      </w:pPr>
+      <w:r>
+        <w:rPr>
+          <w:b/>
+        </w:rPr>
+        <w:t>DTES Neighbourhood House — SRO Collaborative Profile</w:t>
+      </w:r>
+      <w:r>
+        <w:rPr>
+          <w:color w:val="4466AA"/>
+          <w:sz w:val="18"/>
+        </w:rPr>
+        <w:br/>
+        <w:t>https://www.dtesnhouse.ca/news-updates/partner-feature-sro-collaborative</w:t>
+      </w:r>
+      <w:r>
+        <w:rPr>
+          <w:color w:val="666666"/>
+          <w:sz w:val="20"/>
+        </w:rPr>
+        <w:br/>
+        <w:t>Background on the SRO Collaborative's work</w:t>
+      </w:r>
+    </w:p>
+    <w:p>
+      <w:pPr>
+        <w:pStyle w:val="ListBullet"/>
+      </w:pPr>
+      <w:r>
+        <w:rPr>
+          <w:b/>
+        </w:rPr>
+        <w:t>Mission Statement</w:t>
+      </w:r>
+      <w:r>
+        <w:rPr>
+          <w:color w:val="4466AA"/>
+          <w:sz w:val="18"/>
+        </w:rPr>
+        <w:br/>
+        <w:t>https://www.srocollaborative.org/mission-statement</w:t>
+      </w:r>
+      <w:r>
+        <w:rPr>
+          <w:color w:val="666666"/>
+          <w:sz w:val="20"/>
+        </w:rPr>
+        <w:br/>
+        <w:t>Organization mission and tenant-led model</w:t>
+      </w:r>
+    </w:p>
+    <w:p>
+      <w:pPr>
+        <w:pStyle w:val="ListBullet"/>
+      </w:pPr>
+      <w:r>
+        <w:rPr>
+          <w:b/>
+        </w:rPr>
+        <w:t>SRO HUB Program</w:t>
+      </w:r>
+      <w:r>
+        <w:rPr>
+          <w:color w:val="4466AA"/>
+          <w:sz w:val="18"/>
+        </w:rPr>
+        <w:br/>
+        <w:t>https://www.srocollaborative.org/programs/sro-hub-program/</w:t>
+      </w:r>
+      <w:r>
+        <w:rPr>
+          <w:color w:val="666666"/>
+          <w:sz w:val="20"/>
+        </w:rPr>
+        <w:br/>
+        <w:t>Tenant committee support, advocacy, and building-level organizing</w:t>
+      </w:r>
+    </w:p>
+    <w:p>
+      <w:pPr>
+        <w:pStyle w:val="ListBullet"/>
+      </w:pPr>
+      <w:r>
+        <w:rPr>
+          <w:b/>
+        </w:rPr>
+        <w:t>TORO Program</w:t>
+      </w:r>
+      <w:r>
+        <w:rPr>
+          <w:color w:val="4466AA"/>
+          <w:sz w:val="18"/>
+        </w:rPr>
+        <w:br/>
+        <w:t>https://www.srocollaborative.org/programs/toro/</w:t>
+      </w:r>
+      <w:r>
+        <w:rPr>
+          <w:color w:val="666666"/>
+          <w:sz w:val="20"/>
+        </w:rPr>
+        <w:br/>
+        <w:t>Tenant overdose response initiative details</w:t>
+      </w:r>
+    </w:p>
+    <w:p>
+      <w:pPr>
+        <w:pStyle w:val="ListBullet"/>
+      </w:pPr>
+      <w:r>
+        <w:rPr>
+          <w:b/>
+        </w:rPr>
+        <w:t>BC Government Grant Announcement (2023)</w:t>
+      </w:r>
+      <w:r>
+        <w:rPr>
+          <w:color w:val="4466AA"/>
+          <w:sz w:val="18"/>
+        </w:rPr>
+        <w:br/>
+        <w:t>https://news.gov.bc.ca/releases/2023hous0053-000772</w:t>
+      </w:r>
+      <w:r>
+        <w:rPr>
+          <w:color w:val="666666"/>
+          <w:sz w:val="20"/>
+        </w:rPr>
+        <w:br/>
+        <w:t>One-time provincial funding announcement</w:t>
+      </w:r>
+    </w:p>
+    <w:p>
+      <w:r>
+        <w:br w:type="page"/>
+      </w:r>
+    </w:p>
+    <w:p>
+      <w:pPr>
+        <w:pStyle w:val="Heading2"/>
+      </w:pPr>
+      <w:r>
+        <w:t>Stop 5: UBC Learning Exchange</w:t>
+      </w:r>
+    </w:p>
+    <w:p>
+      <w:r>
+        <w:rPr>
+          <w:i/>
+          <w:color w:val="555555"/>
+        </w:rPr>
+        <w:t>Location: 612 Main St, Vancouver</w:t>
+      </w:r>
+    </w:p>
+    <w:p>
+      <w:pPr>
+        <w:pStyle w:val="Heading3"/>
+      </w:pPr>
+      <w:r>
+        <w:t>Quick Facts</w:t>
+      </w:r>
+    </w:p>
+    <w:tbl>
+      <w:tblPr>
+        <w:tblW w:type="auto" w:w="0"/>
+        <w:jc w:val="left"/>
+        <w:tblLook w:firstColumn="1" w:firstRow="1" w:lastColumn="0" w:lastRow="0" w:noHBand="0" w:noVBand="1" w:val="04A0"/>
+      </w:tblPr>
+      <w:tblGrid>
+        <w:gridCol w:w="3120"/>
+        <w:gridCol w:w="3120"/>
+        <w:gridCol w:w="3120"/>
+      </w:tblGrid>
+      <w:tr>
+        <w:tc>
+          <w:tcPr>
+            <w:tcW w:type="dxa" w:w="3120"/>
+          </w:tcPr>
+          <w:p>
+            <w:r>
+              <w:rPr>
+                <w:color w:val="555555"/>
+                <w:sz w:val="20"/>
+              </w:rPr>
+              <w:t xml:space="preserve">Since: </w:t>
+            </w:r>
+            <w:r>
+              <w:rPr>
+                <w:b/>
+                <w:sz w:val="22"/>
+              </w:rPr>
+              <w:t>2000</w:t>
+            </w:r>
+          </w:p>
+        </w:tc>
+        <w:tc>
+          <w:tcPr>
+            <w:tcW w:type="dxa" w:w="3120"/>
+          </w:tcPr>
+          <w:p>
+            <w:r>
+              <w:rPr>
+                <w:color w:val="555555"/>
+                <w:sz w:val="20"/>
+              </w:rPr>
+              <w:t xml:space="preserve">Focus: </w:t>
+            </w:r>
+            <w:r>
+              <w:rPr>
+                <w:b/>
+                <w:sz w:val="22"/>
+              </w:rPr>
+              <w:t>Education</w:t>
+            </w:r>
+          </w:p>
+        </w:tc>
+        <w:tc>
+          <w:tcPr>
+            <w:tcW w:type="dxa" w:w="3120"/>
+          </w:tcPr>
+          <w:p>
+            <w:r>
+              <w:rPr>
+                <w:color w:val="555555"/>
+                <w:sz w:val="20"/>
+              </w:rPr>
+              <w:t xml:space="preserve">Location: </w:t>
+            </w:r>
+            <w:r>
+              <w:rPr>
+                <w:b/>
+                <w:sz w:val="22"/>
+              </w:rPr>
+              <w:t>612 Main St</w:t>
+            </w:r>
+          </w:p>
+        </w:tc>
+      </w:tr>
+    </w:tbl>
+    <w:p/>
+    <w:p>
+      <w:pPr>
+        <w:pStyle w:val="Heading3"/>
+      </w:pPr>
+      <w:r>
+        <w:t>Overview</w:t>
+      </w:r>
+    </w:p>
+    <w:p>
+      <w:pPr/>
+      <w:r>
+        <w:rPr>
+          <w:b w:val="0"/>
+        </w:rPr>
+        <w:t xml:space="preserve">The </w:t>
+      </w:r>
+      <w:r>
+        <w:rPr>
+          <w:b/>
+        </w:rPr>
+        <w:t>UBC Learning Exchange</w:t>
+      </w:r>
+      <w:r>
+        <w:rPr>
+          <w:b w:val="0"/>
+        </w:rPr>
+        <w:t xml:space="preserve"> is a long-running university-community hub in the Downtown Eastside. It has operated from 612 Main Street since the program launched in 2000 as part of UBC's Community Learning Initiative.</w:t>
+      </w:r>
+    </w:p>
+    <w:p>
+      <w:pPr/>
+      <w:r>
+        <w:rPr>
+          <w:b w:val="0"/>
+        </w:rPr>
+        <w:t>Programming focuses on two-way learning: local residents access free educational opportunities while UBC students and faculty engage in community-informed teaching, volunteering, and research.</w:t>
+      </w:r>
+    </w:p>
+    <w:p>
+      <w:pPr/>
+      <w:r>
+        <w:rPr>
+          <w:b w:val="0"/>
+        </w:rPr>
+        <w:t>Core activities include computer and digital literacy support, conversation and communication programming, and partnerships with local organizations on neighbourhood priorities.</w:t>
+      </w:r>
+    </w:p>
+    <w:p>
+      <w:pPr>
+        <w:pStyle w:val="Heading3"/>
+      </w:pPr>
+      <w:r>
+        <w:t>At This Stop</w:t>
+      </w:r>
+    </w:p>
+    <w:p>
+      <w:r>
+        <w:rPr>
+          <w:b/>
+        </w:rPr>
+        <w:t xml:space="preserve">1. </w:t>
+      </w:r>
+      <w:r>
+        <w:rPr>
+          <w:b/>
+        </w:rPr>
+        <w:t>Community Programs</w:t>
+      </w:r>
+      <w:r>
+        <w:rPr>
+          <w:color w:val="777777"/>
+          <w:sz w:val="18"/>
+        </w:rPr>
+        <w:t xml:space="preserve">  [Education]</w:t>
+      </w:r>
+    </w:p>
+    <w:p>
+      <w:pPr>
+        <w:ind w:left="357"/>
+      </w:pPr>
+      <w:r>
+        <w:t>Observe free, resident-centered learning programs delivered at 612 Main Street.</w:t>
+      </w:r>
+    </w:p>
+    <w:p>
+      <w:r>
+        <w:rPr>
+          <w:b/>
+        </w:rPr>
+        <w:t xml:space="preserve">2. </w:t>
+      </w:r>
+      <w:r>
+        <w:rPr>
+          <w:b/>
+        </w:rPr>
+        <w:t>Research Partnerships</w:t>
+      </w:r>
+      <w:r>
+        <w:rPr>
+          <w:color w:val="777777"/>
+          <w:sz w:val="18"/>
+        </w:rPr>
+        <w:t xml:space="preserve">  [Research]</w:t>
+      </w:r>
+    </w:p>
+    <w:p>
+      <w:pPr>
+        <w:ind w:left="357"/>
+      </w:pPr>
+      <w:r>
+        <w:t>Review how community priorities are integrated into UBC teaching and research projects.</w:t>
+      </w:r>
+    </w:p>
+    <w:p>
+      <w:r>
+        <w:rPr>
+          <w:b/>
+        </w:rPr>
+        <w:t xml:space="preserve">3. </w:t>
+      </w:r>
+      <w:r>
+        <w:rPr>
+          <w:b/>
+        </w:rPr>
+        <w:t>Student Involvement</w:t>
+      </w:r>
+      <w:r>
+        <w:rPr>
+          <w:color w:val="777777"/>
+          <w:sz w:val="18"/>
+        </w:rPr>
+        <w:t xml:space="preserve">  [Partnership]</w:t>
+      </w:r>
+    </w:p>
+    <w:p>
+      <w:pPr>
+        <w:ind w:left="357"/>
+      </w:pPr>
+      <w:r>
+        <w:t>See how students contribute through service learning and community-engaged coursework.</w:t>
+      </w:r>
+    </w:p>
+    <w:p>
+      <w:r>
+        <w:rPr>
+          <w:b/>
+        </w:rPr>
+        <w:t xml:space="preserve">4. </w:t>
+      </w:r>
+      <w:r>
+        <w:rPr>
+          <w:b/>
+        </w:rPr>
+        <w:t>Resource Access</w:t>
+      </w:r>
+      <w:r>
+        <w:rPr>
+          <w:color w:val="777777"/>
+          <w:sz w:val="18"/>
+        </w:rPr>
+        <w:t xml:space="preserve">  [Access]</w:t>
+      </w:r>
+    </w:p>
+    <w:p>
+      <w:pPr>
+        <w:ind w:left="357"/>
+      </w:pPr>
+      <w:r>
+        <w:t>Map pathways from the neighbourhood into UBC resources and public-facing services.</w:t>
+      </w:r>
+    </w:p>
+    <w:p>
+      <w:pPr>
+        <w:pStyle w:val="Heading3"/>
+      </w:pPr>
+      <w:r>
+        <w:t>Programs</w:t>
+      </w:r>
+    </w:p>
+    <w:p>
+      <w:pPr>
+        <w:pStyle w:val="Heading4"/>
+      </w:pPr>
+      <w:r>
+        <w:t>Program Model</w:t>
+      </w:r>
+    </w:p>
+    <w:p>
+      <w:pPr/>
+      <w:r>
+        <w:rPr>
+          <w:b w:val="0"/>
+        </w:rPr>
+        <w:t>The Learning Exchange frames its work as reciprocal community learning. Programs are built with community members and local organizations rather than delivered as one-way outreach.</w:t>
+      </w:r>
+    </w:p>
+    <w:p>
+      <w:pPr>
+        <w:pStyle w:val="Heading4"/>
+      </w:pPr>
+      <w:r>
+        <w:t>Education and Skills</w:t>
+      </w:r>
+    </w:p>
+    <w:p>
+      <w:pPr/>
+      <w:r>
+        <w:rPr>
+          <w:b w:val="0"/>
+        </w:rPr>
+        <w:t>Public-facing activities include computer and internet support, literacy and communication programming, and workshops that respond to resident-identified interests.</w:t>
+      </w:r>
+    </w:p>
+    <w:p>
+      <w:pPr>
+        <w:pStyle w:val="Heading4"/>
+      </w:pPr>
+      <w:r>
+        <w:t>University-Community Bridge</w:t>
+      </w:r>
+    </w:p>
+    <w:p>
+      <w:pPr/>
+      <w:r>
+        <w:rPr>
+          <w:b w:val="0"/>
+        </w:rPr>
+        <w:t>The site provides practical entry points for UBC students and faculty to participate in community-engaged learning and collaborative research in the DTES.</w:t>
+      </w:r>
+    </w:p>
+    <w:p>
+      <w:pPr>
+        <w:pStyle w:val="Heading4"/>
+      </w:pPr>
+      <w:r>
+        <w:t>Neighbourhood Partnerships</w:t>
+      </w:r>
+    </w:p>
+    <w:p>
+      <w:pPr/>
+      <w:r>
+        <w:rPr>
+          <w:b w:val="0"/>
+        </w:rPr>
+        <w:t>Partnerships across the DTES shape how UBC resources are shared and how local knowledge is reflected in project design and evaluation.</w:t>
+      </w:r>
+    </w:p>
+    <w:p>
+      <w:pPr>
+        <w:pStyle w:val="ListBullet"/>
+      </w:pPr>
+      <w:r>
+        <w:rPr>
+          <w:b w:val="0"/>
+        </w:rPr>
+        <w:t>Resident-informed education and digital inclusion programming</w:t>
+      </w:r>
+    </w:p>
+    <w:p>
+      <w:pPr>
+        <w:pStyle w:val="ListBullet"/>
+      </w:pPr>
+      <w:r>
+        <w:rPr>
+          <w:b w:val="0"/>
+        </w:rPr>
+        <w:t>Community-engaged teaching and service learning pathways for students</w:t>
+      </w:r>
+    </w:p>
+    <w:p>
+      <w:pPr>
+        <w:pStyle w:val="ListBullet"/>
+      </w:pPr>
+      <w:r>
+        <w:rPr>
+          <w:b w:val="0"/>
+        </w:rPr>
+        <w:t>Long-term collaboration infrastructure between UBC and DTES organizations</w:t>
+      </w:r>
+    </w:p>
+    <w:p/>
+    <w:p>
+      <w:r>
+        <w:rPr>
+          <w:b/>
+          <w:sz w:val="22"/>
+        </w:rPr>
+        <w:t>Key Points</w:t>
+      </w:r>
+    </w:p>
+    <w:p>
+      <w:pPr>
+        <w:pStyle w:val="ListBullet"/>
+      </w:pPr>
+      <w:r>
+        <w:t>University-community partnership since 2000</w:t>
+      </w:r>
+    </w:p>
+    <w:p>
+      <w:pPr>
+        <w:pStyle w:val="ListBullet"/>
+      </w:pPr>
+      <w:r>
+        <w:t>Free educational programming</w:t>
+      </w:r>
+    </w:p>
+    <w:p>
+      <w:pPr>
+        <w:pStyle w:val="ListBullet"/>
+      </w:pPr>
+      <w:r>
+        <w:t>Reciprocal model for research and teaching</w:t>
+      </w:r>
+    </w:p>
+    <w:p>
+      <w:pPr>
+        <w:pStyle w:val="ListBullet"/>
+      </w:pPr>
+      <w:r>
+        <w:t>Based at 612 Main Street in the DTES</w:t>
+      </w:r>
+    </w:p>
+    <w:p>
+      <w:pPr>
+        <w:pStyle w:val="Heading3"/>
+      </w:pPr>
+      <w:r>
+        <w:t>Resources</w:t>
+      </w:r>
+    </w:p>
+    <w:p>
+      <w:pPr>
+        <w:pStyle w:val="ListBullet"/>
+      </w:pPr>
+      <w:r>
+        <w:rPr>
+          <w:b/>
+        </w:rPr>
+        <w:t>UBC Learning Exchange</w:t>
+      </w:r>
+      <w:r>
+        <w:rPr>
+          <w:color w:val="4466AA"/>
+          <w:sz w:val="18"/>
+        </w:rPr>
+        <w:br/>
+        <w:t>https://learningexchange.ubc.ca/</w:t>
+      </w:r>
+      <w:r>
+        <w:rPr>
+          <w:color w:val="666666"/>
+          <w:sz w:val="20"/>
+        </w:rPr>
+        <w:br/>
+        <w:t>Official program website</w:t>
+      </w:r>
+    </w:p>
+    <w:p>
+      <w:pPr>
+        <w:pStyle w:val="ListBullet"/>
+      </w:pPr>
+      <w:r>
+        <w:rPr>
+          <w:b/>
+        </w:rPr>
+        <w:t>Who We Are</w:t>
+      </w:r>
+      <w:r>
+        <w:rPr>
+          <w:color w:val="4466AA"/>
+          <w:sz w:val="18"/>
+        </w:rPr>
+        <w:br/>
+        <w:t>https://learningexchange.ubc.ca/about-us/</w:t>
+      </w:r>
+      <w:r>
+        <w:rPr>
+          <w:color w:val="666666"/>
+          <w:sz w:val="20"/>
+        </w:rPr>
+        <w:br/>
+        <w:t>Program model and reciprocal learning approach</w:t>
+      </w:r>
+    </w:p>
+    <w:p>
+      <w:pPr>
+        <w:pStyle w:val="ListBullet"/>
+      </w:pPr>
+      <w:r>
+        <w:rPr>
+          <w:b/>
+        </w:rPr>
+        <w:t>Place-Based Learning in the DTES</w:t>
+      </w:r>
+      <w:r>
+        <w:rPr>
+          <w:color w:val="4466AA"/>
+          <w:sz w:val="18"/>
+        </w:rPr>
+        <w:br/>
+        <w:t>https://learningexchange.ubc.ca/ubc-student-learning/</w:t>
+      </w:r>
+      <w:r>
+        <w:rPr>
+          <w:color w:val="666666"/>
+          <w:sz w:val="20"/>
+        </w:rPr>
+        <w:br/>
+        <w:t>How 612 Main Street supports community learning</w:t>
+      </w:r>
+    </w:p>
+    <w:p>
+      <w:pPr>
+        <w:pStyle w:val="ListBullet"/>
+      </w:pPr>
+      <w:r>
+        <w:rPr>
+          <w:b/>
+        </w:rPr>
+        <w:t>UBC Today: Learning Exchange at 20 Years</w:t>
+      </w:r>
+      <w:r>
+        <w:rPr>
+          <w:color w:val="4466AA"/>
+          <w:sz w:val="18"/>
+        </w:rPr>
+        <w:br/>
+        <w:t>https://learningexchange.ubc.ca/ubc-learning-exchange-reopens-marks-20-years-in-the-downtown-eastside/</w:t>
+      </w:r>
+      <w:r>
+        <w:rPr>
+          <w:color w:val="666666"/>
+          <w:sz w:val="20"/>
+        </w:rPr>
+        <w:br/>
+        <w:t>History and community impact profile</w:t>
       </w:r>
     </w:p>
     <w:sectPr>

</xml_diff>